<commit_message>
zmeny na ohe serveru
</commit_message>
<xml_diff>
--- a/scripts/reports/template_RPM.docx
+++ b/scripts/reports/template_RPM.docx
@@ -321,228 +321,178 @@
         </w:rPr>
         <w:t>o provedení analýzy chování a vývoje cen</w:t>
       </w:r>
+    </w:p>
+    <w:p>
+      <w:pPr>
+        <w:pStyle w:val="Odstavec"/>
+      </w:pPr>
+      <w:r>
+        <w:t>Úřad pro ochranu hospodářské soutěže (dále jen „</w:t>
+      </w:r>
       <w:r>
         <w:rPr>
           <w:b/>
           <w:bCs/>
         </w:rPr>
-        <w:t xml:space="preserve"> a o vložení dokumentů do spisu</w:t>
-      </w:r>
-    </w:p>
-    <w:p>
-      <w:pPr>
-        <w:pStyle w:val="Odstavec"/>
-      </w:pPr>
-      <w:r>
-        <w:t>Úřad pro ochranu hospodářské soutěže (dále jen „</w:t>
+        <w:t>Úřad</w:t>
+      </w:r>
+      <w:r>
+        <w:t xml:space="preserve">“) v souvislosti se šetřením vedeným pod sp. zn. </w:t>
+      </w:r>
+      <w:r>
+        <w:fldChar w:fldCharType="begin"/>
+      </w:r>
+      <w:r>
+        <w:instrText xml:space="preserve"> DOCPROPERTY "UohsSPZN"</w:instrText>
+      </w:r>
+      <w:r>
+        <w:fldChar w:fldCharType="separate"/>
+      </w:r>
+      <w:r>
+        <w:t>/Spisová značka/</w:t>
+      </w:r>
+      <w:r>
+        <w:fldChar w:fldCharType="end"/>
+      </w:r>
+      <w:r>
+        <w:t xml:space="preserve"> provedl dne </w:t>
       </w:r>
       <w:r>
         <w:rPr>
           <w:b/>
           <w:bCs/>
         </w:rPr>
-        <w:t>Úřad</w:t>
-      </w:r>
-      <w:r>
-        <w:t xml:space="preserve">“) v souvislosti se šetřením vedeným pod </w:t>
-      </w:r>
-      <w:proofErr w:type="spellStart"/>
-      <w:r>
-        <w:t>sp</w:t>
-      </w:r>
-      <w:proofErr w:type="spellEnd"/>
-      <w:r>
-        <w:t xml:space="preserve">. zn. </w:t>
-      </w:r>
-      <w:r>
-        <w:fldChar w:fldCharType="begin"/>
-      </w:r>
-      <w:r>
-        <w:instrText xml:space="preserve"> DOCPROPERTY "UohsSPZN"</w:instrText>
-      </w:r>
-      <w:r>
-        <w:fldChar w:fldCharType="separate"/>
-      </w:r>
-      <w:r>
-        <w:t>/Spisová značka/</w:t>
-      </w:r>
-      <w:r>
-        <w:fldChar w:fldCharType="end"/>
-      </w:r>
-      <w:r>
-        <w:t xml:space="preserve"> (dále jen „</w:t>
-      </w:r>
+        <w:t>[[</w:t>
+      </w:r>
+      <w:proofErr w:type="gramStart"/>
       <w:r>
         <w:rPr>
           <w:b/>
           <w:bCs/>
         </w:rPr>
-        <w:t>spis</w:t>
-      </w:r>
-      <w:r>
-        <w:t xml:space="preserve">“) provedl dne </w:t>
-      </w:r>
+        <w:t>processedAt{</w:t>
+      </w:r>
+      <w:proofErr w:type="gramEnd"/>
       <w:r>
         <w:rPr>
           <w:b/>
           <w:bCs/>
         </w:rPr>
-        <w:t>[[</w:t>
-      </w:r>
-      <w:proofErr w:type="spellStart"/>
-      <w:proofErr w:type="gramStart"/>
+        <w:t>„dateFormat“:“d. M. yyyy“}]]</w:t>
+      </w:r>
       <w:r>
         <w:rPr>
           <w:b/>
           <w:bCs/>
         </w:rPr>
-        <w:t>processedAt</w:t>
-      </w:r>
-      <w:proofErr w:type="spellEnd"/>
+        <w:t xml:space="preserve"> </w:t>
+      </w:r>
+      <w:r>
+        <w:t>analýzu chování a vývoje cen za účelem detekce indicií možné přítomnosti praktiky spočívající v určování cen pro další prodej. Analýza byla provedena na datech z cenové databáze Úřadu.</w:t>
+      </w:r>
+      <w:r>
+        <w:t xml:space="preserve"> Soubor obsahující podkladová data je přílohou č. 1 tohoto přípisu.</w:t>
+      </w:r>
+    </w:p>
+    <w:p>
+      <w:pPr>
+        <w:pStyle w:val="Odstavec"/>
+      </w:pPr>
+      <w:r>
+        <w:t xml:space="preserve">Analýza byla provedena na cenách vybraných produktů a značek za období od </w:t>
+      </w:r>
       <w:r>
         <w:rPr>
           <w:b/>
           <w:bCs/>
         </w:rPr>
-        <w:t>{</w:t>
-      </w:r>
-      <w:proofErr w:type="gramEnd"/>
+        <w:t>[[</w:t>
+      </w:r>
+      <w:proofErr w:type="gramStart"/>
       <w:r>
         <w:rPr>
           <w:b/>
           <w:bCs/>
         </w:rPr>
-        <w:t>„</w:t>
-      </w:r>
-      <w:proofErr w:type="spellStart"/>
+        <w:t>dateFrom{</w:t>
+      </w:r>
+      <w:proofErr w:type="gramEnd"/>
       <w:r>
         <w:rPr>
           <w:b/>
           <w:bCs/>
         </w:rPr>
-        <w:t>dateFormat</w:t>
-      </w:r>
-      <w:proofErr w:type="spellEnd"/>
+        <w:t>„dateFormat“:“d. M. yyyy“}]] do [[</w:t>
+      </w:r>
+      <w:proofErr w:type="gramStart"/>
       <w:r>
         <w:rPr>
           <w:b/>
           <w:bCs/>
         </w:rPr>
-        <w:t xml:space="preserve">“:“d. M. </w:t>
-      </w:r>
-      <w:proofErr w:type="spellStart"/>
+        <w:t>dateTo{</w:t>
+      </w:r>
+      <w:proofErr w:type="gramEnd"/>
       <w:r>
         <w:rPr>
           <w:b/>
           <w:bCs/>
         </w:rPr>
-        <w:t>yyyy</w:t>
-      </w:r>
-      <w:proofErr w:type="spellEnd"/>
+        <w:t xml:space="preserve">„dateFormat“:“d. </w:t>
+      </w:r>
       <w:r>
         <w:rPr>
           <w:b/>
           <w:bCs/>
         </w:rPr>
-        <w:t xml:space="preserve">“}]]  </w:t>
+        <w:t>M.</w:t>
       </w:r>
       <w:r>
         <w:rPr>
           <w:b/>
           <w:bCs/>
         </w:rPr>
-        <w:t xml:space="preserve"> </w:t>
-      </w:r>
-      <w:r>
-        <w:t>analýzu chování a vývoje cen (dále jen „</w:t>
+        <w:t xml:space="preserve"> yyyy“}]],</w:t>
+      </w:r>
+      <w:r>
+        <w:t xml:space="preserve"> přičemž </w:t>
+      </w:r>
+      <w:r>
+        <w:t>vyhodnoceno</w:t>
+      </w:r>
+      <w:r>
+        <w:t xml:space="preserve"> bylo </w:t>
       </w:r>
       <w:r>
         <w:rPr>
           <w:b/>
           <w:bCs/>
         </w:rPr>
-        <w:t>analýza</w:t>
-      </w:r>
-      <w:r>
-        <w:t>“) za účelem detekce indicií možné přítomnosti praktiky spočívající v určování cen pro další prodej. Analýza byla provedena na datech z cenové databáze Úřadu.</w:t>
-      </w:r>
-    </w:p>
-    <w:p>
-      <w:pPr>
-        <w:pStyle w:val="Odstavec"/>
-      </w:pPr>
-      <w:r>
-        <w:t>Úřad tímto vkládá do spisu:</w:t>
-      </w:r>
-    </w:p>
-    <w:p>
-      <w:pPr>
-        <w:pStyle w:val="Odstavec"/>
-        <w:numPr>
-          <w:ilvl w:val="0"/>
-          <w:numId w:val="4"/>
-        </w:numPr>
-      </w:pPr>
-      <w:r>
-        <w:t xml:space="preserve">soubor </w:t>
-      </w:r>
-      <w:r>
-        <w:t>„</w:t>
-      </w:r>
-      <w:r>
-        <w:rPr>
-          <w:i/>
-          <w:iCs/>
-        </w:rPr>
-        <w:t>data</w:t>
-      </w:r>
-      <w:r>
-        <w:rPr>
-          <w:i/>
-          <w:iCs/>
-        </w:rPr>
-        <w:t>.csv</w:t>
-      </w:r>
-      <w:r>
-        <w:t>“</w:t>
-      </w:r>
-      <w:r>
-        <w:t>,</w:t>
-      </w:r>
-      <w:r>
-        <w:t xml:space="preserve"> který obsahuje podkladová data využitá pro dotčenou analýzu.</w:t>
-      </w:r>
-    </w:p>
-    <w:p>
-      <w:pPr>
-        <w:pStyle w:val="Odstavec"/>
-      </w:pPr>
-      <w:r>
-        <w:t xml:space="preserve">Analýza byla provedena na cenách vybraných produktů a značek za období od </w:t>
-      </w:r>
+        <w:t>[[#stat</w:t>
+      </w:r>
+      <w:proofErr w:type="gramStart"/>
       <w:r>
         <w:rPr>
           <w:b/>
           <w:bCs/>
         </w:rPr>
-        <w:t>[[</w:t>
-      </w:r>
-      <w:proofErr w:type="spellStart"/>
-      <w:proofErr w:type="gramStart"/>
+        <w:t>]][</w:t>
+      </w:r>
+      <w:proofErr w:type="gramEnd"/>
       <w:r>
         <w:rPr>
           <w:b/>
           <w:bCs/>
         </w:rPr>
-        <w:t>dateFrom</w:t>
-      </w:r>
-      <w:proofErr w:type="spellEnd"/>
+        <w:t>[priceCount</w:t>
+      </w:r>
+      <w:proofErr w:type="gramStart"/>
       <w:r>
         <w:rPr>
           <w:b/>
           <w:bCs/>
         </w:rPr>
-        <w:t>{</w:t>
+        <w:t>]][</w:t>
       </w:r>
       <w:proofErr w:type="gramEnd"/>
       <w:r>
@@ -550,140 +500,103 @@
           <w:b/>
           <w:bCs/>
         </w:rPr>
-        <w:t>„</w:t>
-      </w:r>
-      <w:proofErr w:type="spellStart"/>
+        <w:t>[/stat]]</w:t>
+      </w:r>
+      <w:r>
+        <w:t xml:space="preserve"> </w:t>
+      </w:r>
+      <w:r>
+        <w:t xml:space="preserve">cenových záznamů pocházejících z veřejně dostupných zdrojů sledovaných </w:t>
+      </w:r>
+      <w:r>
+        <w:t xml:space="preserve">Úřadem </w:t>
+      </w:r>
+      <w:r>
+        <w:t>u</w:t>
+      </w:r>
+      <w:r>
+        <w:t xml:space="preserve"> </w:t>
+      </w:r>
       <w:r>
         <w:rPr>
           <w:b/>
           <w:bCs/>
         </w:rPr>
-        <w:t>dateFormat</w:t>
-      </w:r>
-      <w:proofErr w:type="spellEnd"/>
+        <w:t>[[#stat</w:t>
+      </w:r>
+      <w:proofErr w:type="gramStart"/>
       <w:r>
         <w:rPr>
           <w:b/>
           <w:bCs/>
         </w:rPr>
-        <w:t xml:space="preserve">“:“d. M. </w:t>
-      </w:r>
-      <w:proofErr w:type="spellStart"/>
+        <w:t>]][</w:t>
+      </w:r>
+      <w:proofErr w:type="gramEnd"/>
       <w:r>
         <w:rPr>
           <w:b/>
           <w:bCs/>
         </w:rPr>
-        <w:t>yyyy</w:t>
-      </w:r>
-      <w:proofErr w:type="spellEnd"/>
+        <w:t>[productCount</w:t>
+      </w:r>
+      <w:proofErr w:type="gramStart"/>
       <w:r>
         <w:rPr>
           <w:b/>
           <w:bCs/>
         </w:rPr>
-        <w:t>“}]] do [[</w:t>
-      </w:r>
-      <w:proofErr w:type="spellStart"/>
-      <w:proofErr w:type="gramStart"/>
+        <w:t>]][</w:t>
+      </w:r>
+      <w:proofErr w:type="gramEnd"/>
       <w:r>
         <w:rPr>
           <w:b/>
           <w:bCs/>
         </w:rPr>
-        <w:t>dateTo</w:t>
-      </w:r>
-      <w:proofErr w:type="spellEnd"/>
+        <w:t>[/stat]]</w:t>
+      </w:r>
+      <w:r>
+        <w:t xml:space="preserve"> produktů </w:t>
+      </w:r>
       <w:r>
         <w:rPr>
           <w:b/>
           <w:bCs/>
         </w:rPr>
-        <w:t>{</w:t>
-      </w:r>
-      <w:proofErr w:type="gramEnd"/>
+        <w:t>[[#stat</w:t>
+      </w:r>
+      <w:proofErr w:type="gramStart"/>
       <w:r>
         <w:rPr>
           <w:b/>
           <w:bCs/>
         </w:rPr>
-        <w:t>„</w:t>
-      </w:r>
-      <w:proofErr w:type="spellStart"/>
+        <w:t>]][</w:t>
+      </w:r>
+      <w:proofErr w:type="gramEnd"/>
       <w:r>
         <w:rPr>
           <w:b/>
           <w:bCs/>
         </w:rPr>
-        <w:t>dateFormat</w:t>
-      </w:r>
-      <w:proofErr w:type="spellEnd"/>
+        <w:t>[brandCount</w:t>
+      </w:r>
+      <w:proofErr w:type="gramStart"/>
       <w:r>
         <w:rPr>
           <w:b/>
           <w:bCs/>
         </w:rPr>
-        <w:t xml:space="preserve">“:“d. </w:t>
-      </w:r>
+        <w:t>]][</w:t>
+      </w:r>
+      <w:proofErr w:type="gramEnd"/>
       <w:r>
         <w:rPr>
           <w:b/>
           <w:bCs/>
         </w:rPr>
-        <w:t>M.</w:t>
-      </w:r>
-      <w:r>
-        <w:rPr>
-          <w:b/>
-          <w:bCs/>
-        </w:rPr>
-        <w:t xml:space="preserve"> </w:t>
-      </w:r>
-      <w:proofErr w:type="spellStart"/>
-      <w:r>
-        <w:rPr>
-          <w:b/>
-          <w:bCs/>
-        </w:rPr>
-        <w:t>yyyy</w:t>
-      </w:r>
-      <w:proofErr w:type="spellEnd"/>
-      <w:r>
-        <w:rPr>
-          <w:b/>
-          <w:bCs/>
-        </w:rPr>
-        <w:t>“}]],</w:t>
-      </w:r>
-      <w:r>
-        <w:t xml:space="preserve"> přičemž této analýze bylo podrobeno </w:t>
-      </w:r>
-      <w:r>
-        <w:rPr>
-          <w:b/>
-          <w:bCs/>
-        </w:rPr>
-        <w:t>[[#stat]][[priceCount]][[/stat]]</w:t>
-      </w:r>
-      <w:r>
-        <w:t xml:space="preserve"> Úřadem pozorovaných a veřejně dostupných cen </w:t>
-      </w:r>
-      <w:r>
-        <w:rPr>
-          <w:b/>
-          <w:bCs/>
-        </w:rPr>
-        <w:t>[[#stat]][[productCount]][[/stat]]</w:t>
-      </w:r>
-      <w:r>
-        <w:t xml:space="preserve"> produktů celkem </w:t>
-      </w:r>
-      <w:r>
-        <w:rPr>
-          <w:b/>
-          <w:bCs/>
-        </w:rPr>
-        <w:t>[[#stat]][[brandCount]][[/stat]]</w:t>
+        <w:t>[/stat]]</w:t>
       </w:r>
       <w:r>
         <w:t xml:space="preserve"> značek. Provedená analýza je přílohou č. 2 tohoto přípisu.</w:t>
@@ -696,43 +609,10 @@
       <w:r>
         <w:t>Metodika a výsledky jsou popsány v analýze. Analýza byla provedena automatizovaně.</w:t>
       </w:r>
-    </w:p>
-    <w:p>
-      <w:pPr>
-        <w:pStyle w:val="Odstavec"/>
-      </w:pPr>
-      <w:r>
-        <w:t>Úřad tímto vkládá do spisu:</w:t>
-      </w:r>
-    </w:p>
-    <w:p>
-      <w:pPr>
-        <w:pStyle w:val="Odstavec"/>
-        <w:numPr>
-          <w:ilvl w:val="0"/>
-          <w:numId w:val="6"/>
-        </w:numPr>
-      </w:pPr>
-      <w:r>
-        <w:t xml:space="preserve">soubor </w:t>
-      </w:r>
-      <w:r>
-        <w:t xml:space="preserve">„zdrojovy_kod_analyzy.txt“, </w:t>
-      </w:r>
-      <w:r>
-        <w:t xml:space="preserve">který obsahuje </w:t>
-      </w:r>
-      <w:r>
-        <w:t>sekvenci skriptů, kterými</w:t>
-      </w:r>
-      <w:r>
-        <w:t xml:space="preserve"> </w:t>
-      </w:r>
-      <w:r>
-        <w:t>byla automatizovaná analýza provedena.</w:t>
-      </w:r>
-    </w:p>
-    <w:p/>
+      <w:r>
+        <w:t xml:space="preserve"> Soubor obsahující sekvenci skriptů, kterými byla automatizovaná analýza provedena, je přílohou č. 3 tohoto přípisu.</w:t>
+      </w:r>
+    </w:p>
     <w:p/>
     <w:p>
       <w:bookmarkStart w:id="1" w:name="Text12"/>
@@ -804,63 +684,21 @@
       <w:r>
         <w:t>za období od [[</w:t>
       </w:r>
-      <w:proofErr w:type="spellStart"/>
       <w:proofErr w:type="gramStart"/>
       <w:r>
-        <w:t>dateFrom</w:t>
-      </w:r>
-      <w:proofErr w:type="spellEnd"/>
-      <w:r>
-        <w:t>{</w:t>
+        <w:t>dateFrom{</w:t>
       </w:r>
       <w:proofErr w:type="gramEnd"/>
       <w:r>
-        <w:t>„</w:t>
-      </w:r>
-      <w:proofErr w:type="spellStart"/>
-      <w:r>
-        <w:t>dateFormat</w:t>
-      </w:r>
-      <w:proofErr w:type="spellEnd"/>
-      <w:r>
-        <w:t xml:space="preserve">“:“d. M. </w:t>
-      </w:r>
-      <w:proofErr w:type="spellStart"/>
-      <w:r>
-        <w:t>yyyy</w:t>
-      </w:r>
-      <w:proofErr w:type="spellEnd"/>
-      <w:r>
-        <w:t>“}]] do [[</w:t>
-      </w:r>
-      <w:proofErr w:type="spellStart"/>
+        <w:t>„dateFormat“:“d. M. yyyy“}]] do [[</w:t>
+      </w:r>
       <w:proofErr w:type="gramStart"/>
       <w:r>
-        <w:t>dateTo</w:t>
-      </w:r>
-      <w:proofErr w:type="spellEnd"/>
-      <w:r>
-        <w:t>{</w:t>
+        <w:t>dateTo{</w:t>
       </w:r>
       <w:proofErr w:type="gramEnd"/>
       <w:r>
-        <w:t>„</w:t>
-      </w:r>
-      <w:proofErr w:type="spellStart"/>
-      <w:r>
-        <w:t>dateFormat</w:t>
-      </w:r>
-      <w:proofErr w:type="spellEnd"/>
-      <w:r>
-        <w:t xml:space="preserve">“:“d. M. </w:t>
-      </w:r>
-      <w:proofErr w:type="spellStart"/>
-      <w:r>
-        <w:t>yyyy</w:t>
-      </w:r>
-      <w:proofErr w:type="spellEnd"/>
-      <w:r>
-        <w:t>“}]].</w:t>
+        <w:t>„dateFormat“:“d. M. yyyy“}]].</w:t>
       </w:r>
     </w:p>
     <w:p>
@@ -912,34 +750,13 @@
       <w:r>
         <w:t>[[</w:t>
       </w:r>
-      <w:proofErr w:type="spellStart"/>
       <w:proofErr w:type="gramStart"/>
       <w:r>
-        <w:t>dateFrom</w:t>
-      </w:r>
-      <w:proofErr w:type="spellEnd"/>
-      <w:r>
-        <w:t>{</w:t>
+        <w:t>dateFrom{</w:t>
       </w:r>
       <w:proofErr w:type="gramEnd"/>
       <w:r>
-        <w:t>„</w:t>
-      </w:r>
-      <w:proofErr w:type="spellStart"/>
-      <w:r>
-        <w:t>dateFormat</w:t>
-      </w:r>
-      <w:proofErr w:type="spellEnd"/>
-      <w:r>
-        <w:t xml:space="preserve">“:“d. M. </w:t>
-      </w:r>
-      <w:proofErr w:type="spellStart"/>
-      <w:r>
-        <w:t>yyyy</w:t>
-      </w:r>
-      <w:proofErr w:type="spellEnd"/>
-      <w:r>
-        <w:t>“}]] do</w:t>
+        <w:t>„dateFormat“:“d. M. yyyy“}]] do</w:t>
       </w:r>
       <w:r>
         <w:t> </w:t>
@@ -947,34 +764,13 @@
       <w:r>
         <w:t>[[</w:t>
       </w:r>
-      <w:proofErr w:type="spellStart"/>
       <w:proofErr w:type="gramStart"/>
       <w:r>
-        <w:t>dateTo</w:t>
-      </w:r>
-      <w:proofErr w:type="spellEnd"/>
-      <w:r>
-        <w:t>{</w:t>
+        <w:t>dateTo{</w:t>
       </w:r>
       <w:proofErr w:type="gramEnd"/>
       <w:r>
-        <w:t>„</w:t>
-      </w:r>
-      <w:proofErr w:type="spellStart"/>
-      <w:r>
-        <w:t>dateFormat</w:t>
-      </w:r>
-      <w:proofErr w:type="spellEnd"/>
-      <w:r>
-        <w:t xml:space="preserve">“:“d. M. </w:t>
-      </w:r>
-      <w:proofErr w:type="spellStart"/>
-      <w:r>
-        <w:t>yyyy</w:t>
-      </w:r>
-      <w:proofErr w:type="spellEnd"/>
-      <w:r>
-        <w:t>“}]]</w:t>
+        <w:t>„dateFormat“:“d. M. yyyy“}]]</w:t>
       </w:r>
     </w:p>
     <w:p>
@@ -991,19 +787,19 @@
     </w:p>
     <w:sdt>
       <w:sdtPr>
+        <w:rPr>
+          <w:rFonts w:ascii="Calibri" w:eastAsia="Times New Roman" w:hAnsi="Calibri" w:cs="Times New Roman"/>
+          <w:b w:val="0"/>
+          <w:bCs w:val="0"/>
+          <w:sz w:val="24"/>
+          <w:szCs w:val="20"/>
+        </w:rPr>
         <w:id w:val="1570926009"/>
         <w:docPartObj>
           <w:docPartGallery w:val="Table of Contents"/>
           <w:docPartUnique/>
         </w:docPartObj>
       </w:sdtPr>
-      <w:sdtEndPr>
-        <w:rPr>
-          <w:rFonts w:ascii="Calibri" w:eastAsia="Times New Roman" w:hAnsi="Calibri" w:cs="Times New Roman"/>
-          <w:sz w:val="24"/>
-          <w:szCs w:val="20"/>
-        </w:rPr>
-      </w:sdtEndPr>
       <w:sdtContent>
         <w:p>
           <w:pPr>
@@ -1232,22 +1028,13 @@
               </w:rPr>
               <w:t>[[%</w:t>
             </w:r>
-            <w:proofErr w:type="spellStart"/>
             <w:proofErr w:type="gramStart"/>
             <w:r>
               <w:rPr>
                 <w:rFonts w:asciiTheme="minorHAnsi" w:hAnsiTheme="minorHAnsi" w:cstheme="minorHAnsi"/>
                 <w:sz w:val="20"/>
               </w:rPr>
-              <w:t>img</w:t>
-            </w:r>
-            <w:proofErr w:type="spellEnd"/>
-            <w:r>
-              <w:rPr>
-                <w:rFonts w:asciiTheme="minorHAnsi" w:hAnsiTheme="minorHAnsi" w:cstheme="minorHAnsi"/>
-                <w:sz w:val="20"/>
-              </w:rPr>
-              <w:t>{</w:t>
+              <w:t>img{</w:t>
             </w:r>
             <w:proofErr w:type="gramEnd"/>
             <w:r>
@@ -1255,17 +1042,8 @@
                 <w:rFonts w:asciiTheme="minorHAnsi" w:hAnsiTheme="minorHAnsi" w:cstheme="minorHAnsi"/>
                 <w:sz w:val="20"/>
               </w:rPr>
-              <w:t>“</w:t>
+              <w:t>“product</w:t>
             </w:r>
-            <w:proofErr w:type="spellStart"/>
-            <w:r>
-              <w:rPr>
-                <w:rFonts w:asciiTheme="minorHAnsi" w:hAnsiTheme="minorHAnsi" w:cstheme="minorHAnsi"/>
-                <w:sz w:val="20"/>
-              </w:rPr>
-              <w:t>product</w:t>
-            </w:r>
-            <w:proofErr w:type="spellEnd"/>
             <w:proofErr w:type="gramStart"/>
             <w:r>
               <w:rPr>
@@ -1279,17 +1057,8 @@
                 <w:rFonts w:asciiTheme="minorHAnsi" w:hAnsiTheme="minorHAnsi" w:cstheme="minorHAnsi"/>
                 <w:sz w:val="20"/>
               </w:rPr>
-              <w:t>:</w:t>
+              <w:t>:true</w:t>
             </w:r>
-            <w:proofErr w:type="spellStart"/>
-            <w:r>
-              <w:rPr>
-                <w:rFonts w:asciiTheme="minorHAnsi" w:hAnsiTheme="minorHAnsi" w:cstheme="minorHAnsi"/>
-                <w:sz w:val="20"/>
-              </w:rPr>
-              <w:t>true</w:t>
-            </w:r>
-            <w:proofErr w:type="spellEnd"/>
             <w:proofErr w:type="gramEnd"/>
             <w:r>
               <w:rPr>
@@ -1313,7 +1082,7 @@
           </w:tcPr>
           <w:tbl>
             <w:tblPr>
-              <w:tblW w:w="8592" w:type="dxa"/>
+              <w:tblW w:w="6467" w:type="dxa"/>
               <w:tblInd w:w="47" w:type="dxa"/>
               <w:tblBorders>
                 <w:top w:val="single" w:sz="4" w:space="0" w:color="auto"/>
@@ -1331,8 +1100,8 @@
               <w:tblLook w:val="04A0" w:firstRow="1" w:lastRow="0" w:firstColumn="1" w:lastColumn="0" w:noHBand="0" w:noVBand="1"/>
             </w:tblPr>
             <w:tblGrid>
-              <w:gridCol w:w="5051"/>
-              <w:gridCol w:w="3541"/>
+              <w:gridCol w:w="4908"/>
+              <w:gridCol w:w="1559"/>
             </w:tblGrid>
             <w:tr>
               <w:trPr>
@@ -1340,7 +1109,8 @@
               </w:trPr>
               <w:tc>
                 <w:tcPr>
-                  <w:tcW w:w="5051" w:type="dxa"/>
+                  <w:tcW w:w="4908" w:type="dxa"/>
+                  <w:vAlign w:val="center"/>
                 </w:tcPr>
                 <w:p>
                   <w:pPr>
@@ -1351,7 +1121,8 @@
                       <w:rFonts w:asciiTheme="minorHAnsi" w:hAnsiTheme="minorHAnsi" w:cstheme="minorHAnsi"/>
                       <w:noProof/>
                       <w:color w:val="000000"/>
-                      <w:sz w:val="20"/>
+                      <w:sz w:val="18"/>
+                      <w:szCs w:val="18"/>
                     </w:rPr>
                   </w:pPr>
                   <w:r>
@@ -1359,7 +1130,8 @@
                       <w:rFonts w:asciiTheme="minorHAnsi" w:hAnsiTheme="minorHAnsi" w:cstheme="minorHAnsi"/>
                       <w:noProof/>
                       <w:color w:val="000000"/>
-                      <w:sz w:val="20"/>
+                      <w:sz w:val="18"/>
+                      <w:szCs w:val="18"/>
                     </w:rPr>
                     <w:t>[[#characteristics]][[key]]</w:t>
                   </w:r>
@@ -1367,7 +1139,8 @@
               </w:tc>
               <w:tc>
                 <w:tcPr>
-                  <w:tcW w:w="3541" w:type="dxa"/>
+                  <w:tcW w:w="1559" w:type="dxa"/>
+                  <w:vAlign w:val="center"/>
                 </w:tcPr>
                 <w:p>
                   <w:pPr>
@@ -1377,14 +1150,16 @@
                     <w:rPr>
                       <w:rFonts w:asciiTheme="minorHAnsi" w:hAnsiTheme="minorHAnsi" w:cstheme="minorHAnsi"/>
                       <w:color w:val="000000"/>
-                      <w:sz w:val="20"/>
+                      <w:sz w:val="18"/>
+                      <w:szCs w:val="18"/>
                     </w:rPr>
                   </w:pPr>
                   <w:r>
                     <w:rPr>
                       <w:rFonts w:asciiTheme="minorHAnsi" w:hAnsiTheme="minorHAnsi" w:cstheme="minorHAnsi"/>
                       <w:color w:val="000000"/>
-                      <w:sz w:val="20"/>
+                      <w:sz w:val="18"/>
+                      <w:szCs w:val="18"/>
                     </w:rPr>
                     <w:t>[</w:t>
                   </w:r>
@@ -1392,51 +1167,53 @@
                     <w:rPr>
                       <w:rFonts w:asciiTheme="minorHAnsi" w:hAnsiTheme="minorHAnsi" w:cstheme="minorHAnsi"/>
                       <w:color w:val="000000"/>
-                      <w:sz w:val="20"/>
+                      <w:sz w:val="18"/>
+                      <w:szCs w:val="18"/>
                     </w:rPr>
                     <w:t>[</w:t>
                   </w:r>
-                  <w:proofErr w:type="spellStart"/>
                   <w:r>
                     <w:rPr>
                       <w:rFonts w:asciiTheme="minorHAnsi" w:hAnsiTheme="minorHAnsi" w:cstheme="minorHAnsi"/>
                       <w:color w:val="000000"/>
-                      <w:sz w:val="20"/>
+                      <w:sz w:val="18"/>
+                      <w:szCs w:val="18"/>
                     </w:rPr>
                     <w:t>value</w:t>
                   </w:r>
-                  <w:proofErr w:type="spellEnd"/>
                   <w:r>
                     <w:rPr>
                       <w:rFonts w:asciiTheme="minorHAnsi" w:hAnsiTheme="minorHAnsi" w:cstheme="minorHAnsi"/>
                       <w:color w:val="000000"/>
-                      <w:sz w:val="20"/>
+                      <w:sz w:val="18"/>
+                      <w:szCs w:val="18"/>
                     </w:rPr>
                     <w:t>{</w:t>
                   </w:r>
                   <w:r>
                     <w:rPr>
                       <w:rFonts w:asciiTheme="minorHAnsi" w:hAnsiTheme="minorHAnsi" w:cstheme="minorHAnsi"/>
-                      <w:szCs w:val="24"/>
+                      <w:sz w:val="18"/>
+                      <w:szCs w:val="18"/>
                     </w:rPr>
                     <w:t>“</w:t>
                   </w:r>
-                  <w:proofErr w:type="spellStart"/>
                   <w:r>
                     <w:rPr>
                       <w:rFonts w:asciiTheme="minorHAnsi" w:hAnsiTheme="minorHAnsi" w:cstheme="minorHAnsi"/>
                       <w:color w:val="000000"/>
-                      <w:sz w:val="20"/>
+                      <w:sz w:val="18"/>
+                      <w:szCs w:val="18"/>
                     </w:rPr>
                     <w:t>numFormat</w:t>
                   </w:r>
-                  <w:proofErr w:type="spellEnd"/>
                   <w:proofErr w:type="gramStart"/>
                   <w:r>
                     <w:rPr>
                       <w:rFonts w:asciiTheme="minorHAnsi" w:hAnsiTheme="minorHAnsi" w:cstheme="minorHAnsi"/>
                       <w:color w:val="000000"/>
-                      <w:sz w:val="20"/>
+                      <w:sz w:val="18"/>
+                      <w:szCs w:val="18"/>
                     </w:rPr>
                     <w:t>“:</w:t>
                   </w:r>
@@ -1444,7 +1221,8 @@
                     <w:rPr>
                       <w:rFonts w:asciiTheme="minorHAnsi" w:hAnsiTheme="minorHAnsi" w:cstheme="minorHAnsi"/>
                       <w:color w:val="000000"/>
-                      <w:sz w:val="20"/>
+                      <w:sz w:val="18"/>
+                      <w:szCs w:val="18"/>
                     </w:rPr>
                     <w:t>{</w:t>
                   </w:r>
@@ -1453,7 +1231,8 @@
                     <w:rPr>
                       <w:rFonts w:asciiTheme="minorHAnsi" w:hAnsiTheme="minorHAnsi" w:cstheme="minorHAnsi"/>
                       <w:color w:val="000000"/>
-                      <w:sz w:val="20"/>
+                      <w:sz w:val="18"/>
+                      <w:szCs w:val="18"/>
                     </w:rPr>
                     <w:t>}</w:t>
                   </w:r>
@@ -1461,7 +1240,8 @@
                     <w:rPr>
                       <w:rFonts w:asciiTheme="minorHAnsi" w:hAnsiTheme="minorHAnsi" w:cstheme="minorHAnsi"/>
                       <w:color w:val="000000"/>
-                      <w:sz w:val="20"/>
+                      <w:sz w:val="18"/>
+                      <w:szCs w:val="18"/>
                       <w:lang w:val="en-US"/>
                     </w:rPr>
                     <w:t>}</w:t>
@@ -1471,7 +1251,8 @@
                     <w:rPr>
                       <w:rFonts w:asciiTheme="minorHAnsi" w:hAnsiTheme="minorHAnsi" w:cstheme="minorHAnsi"/>
                       <w:color w:val="000000"/>
-                      <w:sz w:val="20"/>
+                      <w:sz w:val="18"/>
+                      <w:szCs w:val="18"/>
                     </w:rPr>
                     <w:t>]][</w:t>
                   </w:r>
@@ -1480,27 +1261,10 @@
                     <w:rPr>
                       <w:rFonts w:asciiTheme="minorHAnsi" w:hAnsiTheme="minorHAnsi" w:cstheme="minorHAnsi"/>
                       <w:color w:val="000000"/>
-                      <w:sz w:val="20"/>
+                      <w:sz w:val="18"/>
+                      <w:szCs w:val="18"/>
                     </w:rPr>
-                    <w:t>[/</w:t>
-                  </w:r>
-                  <w:proofErr w:type="spellStart"/>
-                  <w:r>
-                    <w:rPr>
-                      <w:rFonts w:asciiTheme="minorHAnsi" w:hAnsiTheme="minorHAnsi" w:cstheme="minorHAnsi"/>
-                      <w:color w:val="000000"/>
-                      <w:sz w:val="20"/>
-                    </w:rPr>
-                    <w:t>characteristics</w:t>
-                  </w:r>
-                  <w:proofErr w:type="spellEnd"/>
-                  <w:r>
-                    <w:rPr>
-                      <w:rFonts w:asciiTheme="minorHAnsi" w:hAnsiTheme="minorHAnsi" w:cstheme="minorHAnsi"/>
-                      <w:color w:val="000000"/>
-                      <w:sz w:val="20"/>
-                    </w:rPr>
-                    <w:t>]]</w:t>
+                    <w:t>[/characteristics]]</w:t>
                   </w:r>
                 </w:p>
               </w:tc>
@@ -1511,7 +1275,8 @@
               <w:jc w:val="left"/>
               <w:rPr>
                 <w:rFonts w:asciiTheme="minorHAnsi" w:hAnsiTheme="minorHAnsi" w:cstheme="minorHAnsi"/>
-                <w:sz w:val="20"/>
+                <w:sz w:val="18"/>
+                <w:szCs w:val="18"/>
               </w:rPr>
             </w:pPr>
           </w:p>
@@ -1540,6 +1305,24 @@
     </w:p>
     <w:p>
       <w:pPr>
+        <w:spacing w:before="120" w:after="120"/>
+        <w:rPr>
+          <w:rFonts w:asciiTheme="minorHAnsi" w:hAnsiTheme="minorHAnsi" w:cstheme="minorHAnsi"/>
+          <w:b/>
+          <w:bCs/>
+          <w:szCs w:val="24"/>
+        </w:rPr>
+      </w:pPr>
+      <w:r>
+        <w:rPr>
+          <w:rFonts w:asciiTheme="minorHAnsi" w:hAnsiTheme="minorHAnsi" w:cstheme="minorHAnsi"/>
+          <w:szCs w:val="24"/>
+        </w:rPr>
+        <w:t>Níže uvedený graf zachycuje častost jednotlivých cen. Pokud je větší množství cen kumulováno ke zdánlivému cenovému dnu, může se jednat o indicii na možné určování cen pro další prodej.</w:t>
+      </w:r>
+    </w:p>
+    <w:p>
+      <w:pPr>
         <w:pStyle w:val="Grafslovan"/>
         <w:spacing w:after="0"/>
       </w:pPr>
@@ -1567,78 +1350,7 @@
           <w:rFonts w:asciiTheme="minorHAnsi" w:hAnsiTheme="minorHAnsi" w:cstheme="minorHAnsi"/>
           <w:szCs w:val="24"/>
         </w:rPr>
-        <w:t>[%</w:t>
-      </w:r>
-      <w:proofErr w:type="spellStart"/>
-      <w:proofErr w:type="gramStart"/>
-      <w:r>
-        <w:rPr>
-          <w:rFonts w:asciiTheme="minorHAnsi" w:hAnsiTheme="minorHAnsi" w:cstheme="minorHAnsi"/>
-          <w:szCs w:val="24"/>
-        </w:rPr>
-        <w:t>img</w:t>
-      </w:r>
-      <w:proofErr w:type="spellEnd"/>
-      <w:r>
-        <w:rPr>
-          <w:rFonts w:asciiTheme="minorHAnsi" w:hAnsiTheme="minorHAnsi" w:cstheme="minorHAnsi"/>
-          <w:szCs w:val="24"/>
-        </w:rPr>
-        <w:t>{</w:t>
-      </w:r>
-      <w:proofErr w:type="gramEnd"/>
-      <w:r>
-        <w:rPr>
-          <w:rFonts w:asciiTheme="minorHAnsi" w:hAnsiTheme="minorHAnsi" w:cstheme="minorHAnsi"/>
-          <w:szCs w:val="24"/>
-        </w:rPr>
-        <w:t>“</w:t>
-      </w:r>
-      <w:proofErr w:type="spellStart"/>
-      <w:r>
-        <w:rPr>
-          <w:rFonts w:asciiTheme="minorHAnsi" w:hAnsiTheme="minorHAnsi" w:cstheme="minorHAnsi"/>
-          <w:szCs w:val="24"/>
-        </w:rPr>
-        <w:t>path</w:t>
-      </w:r>
-      <w:proofErr w:type="spellEnd"/>
-      <w:r>
-        <w:rPr>
-          <w:rFonts w:asciiTheme="minorHAnsi" w:hAnsiTheme="minorHAnsi" w:cstheme="minorHAnsi"/>
-          <w:szCs w:val="24"/>
-        </w:rPr>
-        <w:t>“:“histogram</w:t>
-      </w:r>
-      <w:proofErr w:type="gramStart"/>
-      <w:r>
-        <w:rPr>
-          <w:rFonts w:asciiTheme="minorHAnsi" w:hAnsiTheme="minorHAnsi" w:cstheme="minorHAnsi"/>
-          <w:szCs w:val="24"/>
-        </w:rPr>
-        <w:t>“</w:t>
-      </w:r>
-      <w:r>
-        <w:rPr>
-          <w:rFonts w:asciiTheme="minorHAnsi" w:hAnsiTheme="minorHAnsi" w:cstheme="minorHAnsi"/>
-          <w:szCs w:val="24"/>
-        </w:rPr>
-        <w:t xml:space="preserve"> </w:t>
-      </w:r>
-      <w:r>
-        <w:rPr>
-          <w:rFonts w:asciiTheme="minorHAnsi" w:hAnsiTheme="minorHAnsi" w:cstheme="minorHAnsi"/>
-          <w:szCs w:val="24"/>
-        </w:rPr>
-        <w:t>}</w:t>
-      </w:r>
-      <w:proofErr w:type="gramEnd"/>
-      <w:r>
-        <w:rPr>
-          <w:rFonts w:asciiTheme="minorHAnsi" w:hAnsiTheme="minorHAnsi" w:cstheme="minorHAnsi"/>
-          <w:szCs w:val="24"/>
-        </w:rPr>
-        <w:t>]]</w:t>
+        <w:t>[%img{“path“:“histogram“}]]</w:t>
       </w:r>
     </w:p>
     <w:p>
@@ -1659,22 +1371,6 @@
           <w:szCs w:val="24"/>
         </w:rPr>
         <w:t>Zdroj: vlastní výpočet Úřadu.</w:t>
-      </w:r>
-    </w:p>
-    <w:p>
-      <w:pPr>
-        <w:spacing w:before="120" w:after="120"/>
-        <w:rPr>
-          <w:rFonts w:asciiTheme="minorHAnsi" w:hAnsiTheme="minorHAnsi" w:cstheme="minorHAnsi"/>
-          <w:szCs w:val="24"/>
-        </w:rPr>
-      </w:pPr>
-      <w:r>
-        <w:rPr>
-          <w:rFonts w:asciiTheme="minorHAnsi" w:hAnsiTheme="minorHAnsi" w:cstheme="minorHAnsi"/>
-          <w:szCs w:val="24"/>
-        </w:rPr>
-        <w:t>Výše uvedený graf zachycuje častost jednotlivých cen. Pokud je větší množství cen kumulováno ke zdánlivému cenovému dnu, může se jednat o indicii na možné určování cen pro další prodej.</w:t>
       </w:r>
     </w:p>
     <w:p>
@@ -1715,27 +1411,7 @@
           <w:szCs w:val="28"/>
         </w:rPr>
         <w:lastRenderedPageBreak/>
-        <w:t>[[</w:t>
-      </w:r>
-      <w:proofErr w:type="spellStart"/>
-      <w:r>
-        <w:rPr>
-          <w:rFonts w:asciiTheme="minorHAnsi" w:hAnsiTheme="minorHAnsi" w:cstheme="minorHAnsi"/>
-          <w:b/>
-          <w:bCs/>
-          <w:szCs w:val="28"/>
-        </w:rPr>
-        <w:t>name</w:t>
-      </w:r>
-      <w:proofErr w:type="spellEnd"/>
-      <w:r>
-        <w:rPr>
-          <w:rFonts w:asciiTheme="minorHAnsi" w:hAnsiTheme="minorHAnsi" w:cstheme="minorHAnsi"/>
-          <w:b/>
-          <w:bCs/>
-          <w:szCs w:val="28"/>
-        </w:rPr>
-        <w:t>]]</w:t>
+        <w:t>[[name]]</w:t>
       </w:r>
     </w:p>
     <w:p>
@@ -2076,39 +1752,7 @@
           <w:rFonts w:asciiTheme="minorHAnsi" w:hAnsiTheme="minorHAnsi" w:cstheme="minorHAnsi"/>
           <w:szCs w:val="24"/>
         </w:rPr>
-        <w:t>Následující graf zobrazuje srovnání nejnižší pozorované ceny (</w:t>
-      </w:r>
-      <w:proofErr w:type="spellStart"/>
-      <w:r>
-        <w:rPr>
-          <w:rFonts w:asciiTheme="minorHAnsi" w:hAnsiTheme="minorHAnsi" w:cstheme="minorHAnsi"/>
-          <w:szCs w:val="24"/>
-        </w:rPr>
-        <w:t>min_price</w:t>
-      </w:r>
-      <w:proofErr w:type="spellEnd"/>
-      <w:r>
-        <w:rPr>
-          <w:rFonts w:asciiTheme="minorHAnsi" w:hAnsiTheme="minorHAnsi" w:cstheme="minorHAnsi"/>
-          <w:szCs w:val="24"/>
-        </w:rPr>
-        <w:t>), průměrné ceny (</w:t>
-      </w:r>
-      <w:proofErr w:type="spellStart"/>
-      <w:r>
-        <w:rPr>
-          <w:rFonts w:asciiTheme="minorHAnsi" w:hAnsiTheme="minorHAnsi" w:cstheme="minorHAnsi"/>
-          <w:szCs w:val="24"/>
-        </w:rPr>
-        <w:t>avg_price</w:t>
-      </w:r>
-      <w:proofErr w:type="spellEnd"/>
-      <w:r>
-        <w:rPr>
-          <w:rFonts w:asciiTheme="minorHAnsi" w:hAnsiTheme="minorHAnsi" w:cstheme="minorHAnsi"/>
-          <w:szCs w:val="24"/>
-        </w:rPr>
-        <w:t>) a nejnižší nejčastější ceny (</w:t>
+        <w:t>Následující graf zobrazuje srovnání nejnižší pozorované ceny (min_price), průměrné ceny (avg_price) a nejnižší nejčastější ceny (</w:t>
       </w:r>
       <m:oMath>
         <m:sSubSup>
@@ -2150,16 +1794,8 @@
         <w:rPr>
           <w:rFonts w:asciiTheme="minorHAnsi" w:hAnsiTheme="minorHAnsi" w:cstheme="minorHAnsi"/>
         </w:rPr>
-        <w:t xml:space="preserve"> v grafu označené jako </w:t>
-      </w:r>
-      <w:proofErr w:type="spellStart"/>
-      <w:r>
-        <w:rPr>
-          <w:rFonts w:asciiTheme="minorHAnsi" w:hAnsiTheme="minorHAnsi" w:cstheme="minorHAnsi"/>
-        </w:rPr>
-        <w:t>mode_price</w:t>
-      </w:r>
-      <w:proofErr w:type="spellEnd"/>
+        <w:t xml:space="preserve"> v grafu označené jako mode_price</w:t>
+      </w:r>
       <w:r>
         <w:rPr>
           <w:rFonts w:asciiTheme="minorHAnsi" w:hAnsiTheme="minorHAnsi" w:cstheme="minorHAnsi"/>
@@ -2200,55 +1836,7 @@
           <w:rFonts w:asciiTheme="minorHAnsi" w:hAnsiTheme="minorHAnsi" w:cstheme="minorHAnsi"/>
           <w:szCs w:val="24"/>
         </w:rPr>
-        <w:t>[%</w:t>
-      </w:r>
-      <w:proofErr w:type="spellStart"/>
-      <w:r>
-        <w:rPr>
-          <w:rFonts w:asciiTheme="minorHAnsi" w:hAnsiTheme="minorHAnsi" w:cstheme="minorHAnsi"/>
-          <w:szCs w:val="24"/>
-        </w:rPr>
-        <w:t>img</w:t>
-      </w:r>
-      <w:proofErr w:type="spellEnd"/>
-      <w:r>
-        <w:rPr>
-          <w:rFonts w:asciiTheme="minorHAnsi" w:hAnsiTheme="minorHAnsi" w:cstheme="minorHAnsi"/>
-          <w:szCs w:val="24"/>
-        </w:rPr>
-        <w:t>{“</w:t>
-      </w:r>
-      <w:proofErr w:type="spellStart"/>
-      <w:r>
-        <w:rPr>
-          <w:rFonts w:asciiTheme="minorHAnsi" w:hAnsiTheme="minorHAnsi" w:cstheme="minorHAnsi"/>
-          <w:szCs w:val="24"/>
-        </w:rPr>
-        <w:t>path</w:t>
-      </w:r>
-      <w:proofErr w:type="spellEnd"/>
-      <w:r>
-        <w:rPr>
-          <w:rFonts w:asciiTheme="minorHAnsi" w:hAnsiTheme="minorHAnsi" w:cstheme="minorHAnsi"/>
-          <w:szCs w:val="24"/>
-        </w:rPr>
-        <w:t>“:“</w:t>
-      </w:r>
-      <w:proofErr w:type="spellStart"/>
-      <w:r>
-        <w:rPr>
-          <w:rFonts w:asciiTheme="minorHAnsi" w:hAnsiTheme="minorHAnsi" w:cstheme="minorHAnsi"/>
-          <w:szCs w:val="24"/>
-        </w:rPr>
-        <w:t>min_mode_avg</w:t>
-      </w:r>
-      <w:proofErr w:type="spellEnd"/>
-      <w:r>
-        <w:rPr>
-          <w:rFonts w:asciiTheme="minorHAnsi" w:hAnsiTheme="minorHAnsi" w:cstheme="minorHAnsi"/>
-          <w:szCs w:val="24"/>
-        </w:rPr>
-        <w:t>“}]]</w:t>
+        <w:t>[%img{“path“:“min_mode_avg“}]]</w:t>
       </w:r>
     </w:p>
     <w:p>
@@ -2291,23 +1879,7 @@
           <w:rFonts w:asciiTheme="minorHAnsi" w:hAnsiTheme="minorHAnsi" w:cstheme="minorHAnsi"/>
           <w:szCs w:val="24"/>
         </w:rPr>
-        <w:t xml:space="preserve"> (</w:t>
-      </w:r>
-      <w:proofErr w:type="spellStart"/>
-      <w:r>
-        <w:rPr>
-          <w:rFonts w:asciiTheme="minorHAnsi" w:hAnsiTheme="minorHAnsi" w:cstheme="minorHAnsi"/>
-          <w:szCs w:val="24"/>
-        </w:rPr>
-        <w:t>min_price</w:t>
-      </w:r>
-      <w:proofErr w:type="spellEnd"/>
-      <w:r>
-        <w:rPr>
-          <w:rFonts w:asciiTheme="minorHAnsi" w:hAnsiTheme="minorHAnsi" w:cstheme="minorHAnsi"/>
-          <w:szCs w:val="24"/>
-        </w:rPr>
-        <w:t>)</w:t>
+        <w:t xml:space="preserve"> (min_price)</w:t>
       </w:r>
       <w:r>
         <w:rPr>
@@ -2321,23 +1893,7 @@
           <w:rFonts w:asciiTheme="minorHAnsi" w:hAnsiTheme="minorHAnsi" w:cstheme="minorHAnsi"/>
           <w:szCs w:val="24"/>
         </w:rPr>
-        <w:t xml:space="preserve"> (</w:t>
-      </w:r>
-      <w:proofErr w:type="spellStart"/>
-      <w:r>
-        <w:rPr>
-          <w:rFonts w:asciiTheme="minorHAnsi" w:hAnsiTheme="minorHAnsi" w:cstheme="minorHAnsi"/>
-          <w:szCs w:val="24"/>
-        </w:rPr>
-        <w:t>mode_price</w:t>
-      </w:r>
-      <w:proofErr w:type="spellEnd"/>
-      <w:r>
-        <w:rPr>
-          <w:rFonts w:asciiTheme="minorHAnsi" w:hAnsiTheme="minorHAnsi" w:cstheme="minorHAnsi"/>
-          <w:szCs w:val="24"/>
-        </w:rPr>
-        <w:t>)</w:t>
+        <w:t xml:space="preserve"> (mode_price)</w:t>
       </w:r>
       <w:r>
         <w:rPr>
@@ -2351,23 +1907,7 @@
           <w:rFonts w:asciiTheme="minorHAnsi" w:hAnsiTheme="minorHAnsi" w:cstheme="minorHAnsi"/>
           <w:szCs w:val="24"/>
         </w:rPr>
-        <w:t xml:space="preserve"> tržní subjekty na nabídkové straně </w:t>
-      </w:r>
-      <w:proofErr w:type="spellStart"/>
-      <w:r>
-        <w:rPr>
-          <w:rFonts w:asciiTheme="minorHAnsi" w:hAnsiTheme="minorHAnsi" w:cstheme="minorHAnsi"/>
-          <w:szCs w:val="24"/>
-        </w:rPr>
-        <w:t>nepodkračují</w:t>
-      </w:r>
-      <w:proofErr w:type="spellEnd"/>
-      <w:r>
-        <w:rPr>
-          <w:rFonts w:asciiTheme="minorHAnsi" w:hAnsiTheme="minorHAnsi" w:cstheme="minorHAnsi"/>
-          <w:szCs w:val="24"/>
-        </w:rPr>
-        <w:t>.</w:t>
+        <w:t xml:space="preserve"> tržní subjekty na nabídkové straně nepodkračují.</w:t>
       </w:r>
     </w:p>
     <w:p>
@@ -2408,27 +1948,7 @@
           <w:szCs w:val="28"/>
         </w:rPr>
         <w:lastRenderedPageBreak/>
-        <w:t>[[</w:t>
-      </w:r>
-      <w:proofErr w:type="spellStart"/>
-      <w:r>
-        <w:rPr>
-          <w:rFonts w:asciiTheme="minorHAnsi" w:hAnsiTheme="minorHAnsi" w:cstheme="minorHAnsi"/>
-          <w:b/>
-          <w:bCs/>
-          <w:szCs w:val="28"/>
-        </w:rPr>
-        <w:t>name</w:t>
-      </w:r>
-      <w:proofErr w:type="spellEnd"/>
-      <w:r>
-        <w:rPr>
-          <w:rFonts w:asciiTheme="minorHAnsi" w:hAnsiTheme="minorHAnsi" w:cstheme="minorHAnsi"/>
-          <w:b/>
-          <w:bCs/>
-          <w:szCs w:val="28"/>
-        </w:rPr>
-        <w:t>]]</w:t>
+        <w:t>[[name]]</w:t>
       </w:r>
     </w:p>
     <w:p>
@@ -2980,16 +2500,142 @@
         <w:spacing w:before="120" w:after="120"/>
       </w:pPr>
       <w:r>
-        <w:t>Tato podmínka eliminuje chybné detekce sladěnosti pro produkty s různými cenami a relativně malým počtem pozorování.</w:t>
-      </w:r>
-      <w:r>
-        <w:rPr>
-          <w:vertAlign w:val="superscript"/>
-        </w:rPr>
-        <w:footnoteReference w:id="1"/>
-      </w:r>
-      <w:r>
-        <w:t xml:space="preserve"> V takovém případě je hodnota sladěnosti cen nahrazena nulou.</w:t>
+        <w:t xml:space="preserve">Tato podmínka eliminuje chybné detekce sladěnosti pro produkty s různými cenami a relativně malým počtem pozorování. </w:t>
+      </w:r>
+      <w:r>
+        <w:t xml:space="preserve">Např. byly-li by pozorovány pouze dvě různé ceny, tak by hodnota sladěnosti cen byla </w:t>
+      </w:r>
+      <m:oMath>
+        <m:sSubSup>
+          <m:sSubSupPr>
+            <m:ctrlPr>
+              <w:rPr>
+                <w:rFonts w:ascii="Cambria Math" w:hAnsi="Cambria Math"/>
+                <w:i/>
+              </w:rPr>
+            </m:ctrlPr>
+          </m:sSubSupPr>
+          <m:e>
+            <m:r>
+              <w:rPr>
+                <w:rFonts w:ascii="Cambria Math" w:hAnsi="Cambria Math"/>
+              </w:rPr>
+              <m:t>s</m:t>
+            </m:r>
+          </m:e>
+          <m:sub>
+            <m:r>
+              <w:rPr>
+                <w:rFonts w:ascii="Cambria Math" w:hAnsi="Cambria Math"/>
+              </w:rPr>
+              <m:t>t</m:t>
+            </m:r>
+          </m:sub>
+          <m:sup>
+            <m:r>
+              <w:rPr>
+                <w:rFonts w:ascii="Cambria Math" w:hAnsi="Cambria Math"/>
+              </w:rPr>
+              <m:t>X</m:t>
+            </m:r>
+          </m:sup>
+        </m:sSubSup>
+        <m:r>
+          <w:rPr>
+            <w:rFonts w:ascii="Cambria Math" w:hAnsi="Cambria Math"/>
+          </w:rPr>
+          <m:t>=0,5</m:t>
+        </m:r>
+      </m:oMath>
+      <w:r>
+        <w:t>, což by chybně mohlo vést k závěru o relativní sladěnosti na trhu pozorovaných cen.</w:t>
+      </w:r>
+      <w:r>
+        <w:t xml:space="preserve"> </w:t>
+      </w:r>
+      <w:r>
+        <w:t>V</w:t>
+      </w:r>
+      <w:r>
+        <w:t xml:space="preserve"> </w:t>
+      </w:r>
+      <w:r>
+        <w:t>takovém případě je hodnota sladěnosti cen nahrazena nulou.</w:t>
+      </w:r>
+    </w:p>
+    <w:p>
+      <w:pPr>
+        <w:spacing w:before="120" w:after="120"/>
+        <w:rPr>
+          <w:rFonts w:asciiTheme="minorHAnsi" w:hAnsiTheme="minorHAnsi" w:cstheme="minorHAnsi"/>
+          <w:szCs w:val="24"/>
+        </w:rPr>
+      </w:pPr>
+      <w:r>
+        <w:rPr>
+          <w:rFonts w:asciiTheme="minorHAnsi" w:hAnsiTheme="minorHAnsi" w:cstheme="minorHAnsi"/>
+          <w:szCs w:val="24"/>
+        </w:rPr>
+        <w:t>Následující graf zobrazuje vypočtené hodnoty podílu sladěnosti cen analyzovaného produktu (S).</w:t>
+      </w:r>
+    </w:p>
+    <w:p>
+      <w:pPr>
+        <w:pStyle w:val="Grafslovan"/>
+        <w:spacing w:after="0"/>
+      </w:pPr>
+      <w:r>
+        <w:t>Vývoj podílu sladěnosti cen vybraného produktu za vybrané období.</w:t>
+      </w:r>
+    </w:p>
+    <w:p>
+      <w:pPr>
+        <w:jc w:val="center"/>
+        <w:rPr>
+          <w:rFonts w:asciiTheme="minorHAnsi" w:hAnsiTheme="minorHAnsi" w:cstheme="minorHAnsi"/>
+          <w:szCs w:val="24"/>
+        </w:rPr>
+      </w:pPr>
+      <w:r>
+        <w:rPr>
+          <w:rFonts w:asciiTheme="minorHAnsi" w:hAnsiTheme="minorHAnsi" w:cstheme="minorHAnsi"/>
+          <w:szCs w:val="24"/>
+        </w:rPr>
+        <w:t>[[%img</w:t>
+      </w:r>
+      <w:r>
+        <w:rPr>
+          <w:rFonts w:asciiTheme="minorHAnsi" w:hAnsiTheme="minorHAnsi" w:cstheme="minorHAnsi"/>
+          <w:szCs w:val="24"/>
+        </w:rPr>
+        <w:t>{“path“:“sladenost“}</w:t>
+      </w:r>
+      <w:r>
+        <w:rPr>
+          <w:rFonts w:asciiTheme="minorHAnsi" w:hAnsiTheme="minorHAnsi" w:cstheme="minorHAnsi"/>
+          <w:szCs w:val="24"/>
+        </w:rPr>
+        <w:t>]]</w:t>
+      </w:r>
+    </w:p>
+    <w:p>
+      <w:pPr>
+        <w:spacing w:after="120"/>
+        <w:rPr>
+          <w:rFonts w:asciiTheme="minorHAnsi" w:hAnsiTheme="minorHAnsi" w:cstheme="minorHAnsi"/>
+          <w:i/>
+          <w:iCs/>
+          <w:szCs w:val="24"/>
+        </w:rPr>
+      </w:pPr>
+      <w:r>
+        <w:rPr>
+          <w:rFonts w:asciiTheme="minorHAnsi" w:hAnsiTheme="minorHAnsi" w:cstheme="minorHAnsi"/>
+          <w:i/>
+          <w:iCs/>
+          <w:szCs w:val="24"/>
+        </w:rPr>
+        <w:t>Zdroj: vlastní výpočet Úřadu.</w:t>
       </w:r>
     </w:p>
     <w:p>
@@ -3153,122 +2799,6 @@
     </w:p>
     <w:p>
       <w:pPr>
-        <w:spacing w:before="120" w:after="120"/>
-        <w:rPr>
-          <w:rFonts w:asciiTheme="minorHAnsi" w:hAnsiTheme="minorHAnsi" w:cstheme="minorHAnsi"/>
-          <w:szCs w:val="24"/>
-        </w:rPr>
-      </w:pPr>
-      <w:r>
-        <w:rPr>
-          <w:rFonts w:asciiTheme="minorHAnsi" w:hAnsiTheme="minorHAnsi" w:cstheme="minorHAnsi"/>
-          <w:szCs w:val="24"/>
-        </w:rPr>
-        <w:t>Následující graf zobrazuje vypočtené hodnoty podílu sladěnosti cen analyzovaného produktu (S).</w:t>
-      </w:r>
-    </w:p>
-    <w:p>
-      <w:pPr>
-        <w:pStyle w:val="Grafslovan"/>
-        <w:spacing w:after="0"/>
-      </w:pPr>
-      <w:r>
-        <w:t>Vývoj podílu sladěnosti cen vybraného produktu za vybrané období.</w:t>
-      </w:r>
-    </w:p>
-    <w:p>
-      <w:pPr>
-        <w:jc w:val="center"/>
-        <w:rPr>
-          <w:rFonts w:asciiTheme="minorHAnsi" w:hAnsiTheme="minorHAnsi" w:cstheme="minorHAnsi"/>
-          <w:szCs w:val="24"/>
-        </w:rPr>
-      </w:pPr>
-      <w:r>
-        <w:rPr>
-          <w:rFonts w:asciiTheme="minorHAnsi" w:hAnsiTheme="minorHAnsi" w:cstheme="minorHAnsi"/>
-          <w:szCs w:val="24"/>
-        </w:rPr>
-        <w:t>[[%</w:t>
-      </w:r>
-      <w:proofErr w:type="spellStart"/>
-      <w:r>
-        <w:rPr>
-          <w:rFonts w:asciiTheme="minorHAnsi" w:hAnsiTheme="minorHAnsi" w:cstheme="minorHAnsi"/>
-          <w:szCs w:val="24"/>
-        </w:rPr>
-        <w:t>img</w:t>
-      </w:r>
-      <w:proofErr w:type="spellEnd"/>
-      <w:r>
-        <w:rPr>
-          <w:rFonts w:asciiTheme="minorHAnsi" w:hAnsiTheme="minorHAnsi" w:cstheme="minorHAnsi"/>
-          <w:szCs w:val="24"/>
-        </w:rPr>
-        <w:t>{“</w:t>
-      </w:r>
-      <w:proofErr w:type="spellStart"/>
-      <w:r>
-        <w:rPr>
-          <w:rFonts w:asciiTheme="minorHAnsi" w:hAnsiTheme="minorHAnsi" w:cstheme="minorHAnsi"/>
-          <w:szCs w:val="24"/>
-        </w:rPr>
-        <w:t>path</w:t>
-      </w:r>
-      <w:proofErr w:type="spellEnd"/>
-      <w:r>
-        <w:rPr>
-          <w:rFonts w:asciiTheme="minorHAnsi" w:hAnsiTheme="minorHAnsi" w:cstheme="minorHAnsi"/>
-          <w:szCs w:val="24"/>
-        </w:rPr>
-        <w:t>“:“</w:t>
-      </w:r>
-      <w:proofErr w:type="spellStart"/>
-      <w:r>
-        <w:rPr>
-          <w:rFonts w:asciiTheme="minorHAnsi" w:hAnsiTheme="minorHAnsi" w:cstheme="minorHAnsi"/>
-          <w:szCs w:val="24"/>
-        </w:rPr>
-        <w:t>sladenost</w:t>
-      </w:r>
-      <w:proofErr w:type="spellEnd"/>
-      <w:r>
-        <w:rPr>
-          <w:rFonts w:asciiTheme="minorHAnsi" w:hAnsiTheme="minorHAnsi" w:cstheme="minorHAnsi"/>
-          <w:szCs w:val="24"/>
-        </w:rPr>
-        <w:t>“}</w:t>
-      </w:r>
-      <w:r>
-        <w:rPr>
-          <w:rFonts w:asciiTheme="minorHAnsi" w:hAnsiTheme="minorHAnsi" w:cstheme="minorHAnsi"/>
-          <w:szCs w:val="24"/>
-        </w:rPr>
-        <w:t>]]</w:t>
-      </w:r>
-    </w:p>
-    <w:p>
-      <w:pPr>
-        <w:spacing w:after="120"/>
-        <w:rPr>
-          <w:rFonts w:asciiTheme="minorHAnsi" w:hAnsiTheme="minorHAnsi" w:cstheme="minorHAnsi"/>
-          <w:i/>
-          <w:iCs/>
-          <w:szCs w:val="24"/>
-        </w:rPr>
-      </w:pPr>
-      <w:r>
-        <w:rPr>
-          <w:rFonts w:asciiTheme="minorHAnsi" w:hAnsiTheme="minorHAnsi" w:cstheme="minorHAnsi"/>
-          <w:i/>
-          <w:iCs/>
-          <w:szCs w:val="24"/>
-        </w:rPr>
-        <w:t>Zdroj: vlastní výpočet Úřadu.</w:t>
-      </w:r>
-    </w:p>
-    <w:p>
-      <w:pPr>
         <w:suppressAutoHyphens w:val="0"/>
         <w:spacing w:before="120" w:after="120"/>
       </w:pPr>
@@ -3290,15 +2820,20 @@
     </w:p>
     <w:p>
       <w:pPr>
-        <w:numPr>
-          <w:ilvl w:val="0"/>
-          <w:numId w:val="18"/>
-        </w:numPr>
+        <w:tabs>
+          <w:tab w:val="left" w:pos="1276"/>
+        </w:tabs>
         <w:suppressAutoHyphens w:val="0"/>
         <w:spacing w:before="120" w:after="120"/>
-        <w:ind w:left="1276"/>
+        <w:ind w:left="567"/>
         <w:contextualSpacing/>
       </w:pPr>
+      <w:r>
+        <w:t>i)</w:t>
+      </w:r>
+      <w:r>
+        <w:tab/>
+      </w:r>
       <m:oMath>
         <m:sSubSup>
           <m:sSubSupPr>
@@ -3380,15 +2915,20 @@
     </w:p>
     <w:p>
       <w:pPr>
-        <w:numPr>
-          <w:ilvl w:val="0"/>
-          <w:numId w:val="18"/>
-        </w:numPr>
+        <w:tabs>
+          <w:tab w:val="left" w:pos="1276"/>
+        </w:tabs>
         <w:suppressAutoHyphens w:val="0"/>
         <w:spacing w:before="120" w:after="120"/>
-        <w:ind w:left="1276"/>
+        <w:ind w:left="1276" w:hanging="709"/>
         <w:contextualSpacing/>
       </w:pPr>
+      <w:r>
+        <w:t>ii)</w:t>
+      </w:r>
+      <w:r>
+        <w:tab/>
+      </w:r>
       <m:oMath>
         <m:sSubSup>
           <m:sSubSupPr>
@@ -3470,15 +3010,20 @@
     </w:p>
     <w:p>
       <w:pPr>
-        <w:numPr>
-          <w:ilvl w:val="0"/>
-          <w:numId w:val="18"/>
-        </w:numPr>
+        <w:tabs>
+          <w:tab w:val="left" w:pos="1276"/>
+        </w:tabs>
         <w:suppressAutoHyphens w:val="0"/>
         <w:spacing w:before="120" w:after="120"/>
-        <w:ind w:left="1276"/>
+        <w:ind w:left="1276" w:hanging="709"/>
         <w:contextualSpacing/>
       </w:pPr>
+      <w:r>
+        <w:t>iii)</w:t>
+      </w:r>
+      <w:r>
+        <w:tab/>
+      </w:r>
       <m:oMath>
         <m:sSubSup>
           <m:sSubSupPr>
@@ -3585,67 +3130,27 @@
           <w:szCs w:val="28"/>
         </w:rPr>
         <w:lastRenderedPageBreak/>
-        <w:t>[[</w:t>
-      </w:r>
-      <w:proofErr w:type="spellStart"/>
-      <w:r>
+        <w:t>[[name]]</w:t>
+      </w:r>
+    </w:p>
+    <w:p>
+      <w:pPr>
+        <w:spacing w:before="120" w:after="120"/>
         <w:rPr>
           <w:rFonts w:asciiTheme="minorHAnsi" w:hAnsiTheme="minorHAnsi" w:cstheme="minorHAnsi"/>
           <w:b/>
           <w:bCs/>
-          <w:szCs w:val="28"/>
-        </w:rPr>
-        <w:t>name</w:t>
-      </w:r>
-      <w:proofErr w:type="spellEnd"/>
+          <w:szCs w:val="24"/>
+        </w:rPr>
+      </w:pPr>
       <w:r>
         <w:rPr>
           <w:rFonts w:asciiTheme="minorHAnsi" w:hAnsiTheme="minorHAnsi" w:cstheme="minorHAnsi"/>
           <w:b/>
           <w:bCs/>
-          <w:szCs w:val="28"/>
-        </w:rPr>
-        <w:t>]]</w:t>
-      </w:r>
-    </w:p>
-    <w:p>
-      <w:pPr>
-        <w:spacing w:before="120" w:after="120"/>
-        <w:rPr>
-          <w:rFonts w:asciiTheme="minorHAnsi" w:hAnsiTheme="minorHAnsi" w:cstheme="minorHAnsi"/>
-          <w:b/>
-          <w:bCs/>
-          <w:szCs w:val="24"/>
-        </w:rPr>
-      </w:pPr>
-      <w:r>
-        <w:rPr>
-          <w:rFonts w:asciiTheme="minorHAnsi" w:hAnsiTheme="minorHAnsi" w:cstheme="minorHAnsi"/>
-          <w:b/>
-          <w:bCs/>
-          <w:szCs w:val="24"/>
-        </w:rPr>
-        <w:t xml:space="preserve">Cenový odstup A </w:t>
-      </w:r>
-      <w:proofErr w:type="spellStart"/>
-      <w:r>
-        <w:rPr>
-          <w:rFonts w:asciiTheme="minorHAnsi" w:hAnsiTheme="minorHAnsi" w:cstheme="minorHAnsi"/>
-          <w:b/>
-          <w:bCs/>
-          <w:szCs w:val="24"/>
-        </w:rPr>
-        <w:t>a</w:t>
-      </w:r>
-      <w:proofErr w:type="spellEnd"/>
-      <w:r>
-        <w:rPr>
-          <w:rFonts w:asciiTheme="minorHAnsi" w:hAnsiTheme="minorHAnsi" w:cstheme="minorHAnsi"/>
-          <w:b/>
-          <w:bCs/>
-          <w:szCs w:val="24"/>
-        </w:rPr>
-        <w:t xml:space="preserve"> B:</w:t>
+          <w:szCs w:val="24"/>
+        </w:rPr>
+        <w:t>Cenový odstup A a B:</w:t>
       </w:r>
     </w:p>
     <w:p>
@@ -5031,15 +4536,7 @@
         </w:rPr>
       </w:pPr>
       <w:r>
-        <w:t>Následující graf zobrazuje vypočtené hodnoty cenových odstupů A (</w:t>
-      </w:r>
-      <w:proofErr w:type="spellStart"/>
-      <w:r>
-        <w:t>dA</w:t>
-      </w:r>
-      <w:proofErr w:type="spellEnd"/>
-      <w:r>
-        <w:t>) a B (dB).</w:t>
+        <w:t>Následující graf zobrazuje vypočtené hodnoty cenových odstupů A (dA) a B (dB).</w:t>
       </w:r>
     </w:p>
     <w:p>
@@ -5051,15 +4548,7 @@
         <w:t xml:space="preserve">Vývoj </w:t>
       </w:r>
       <w:r>
-        <w:t xml:space="preserve">cenového odstupu A </w:t>
-      </w:r>
-      <w:proofErr w:type="spellStart"/>
-      <w:r>
-        <w:t>a</w:t>
-      </w:r>
-      <w:proofErr w:type="spellEnd"/>
-      <w:r>
-        <w:t xml:space="preserve"> B</w:t>
+        <w:t>cenového odstupu A a B</w:t>
       </w:r>
       <w:r>
         <w:t xml:space="preserve"> vybraného produktu za vybrané období.</w:t>
@@ -5078,47 +4567,14 @@
           <w:rFonts w:asciiTheme="minorHAnsi" w:hAnsiTheme="minorHAnsi" w:cstheme="minorHAnsi"/>
           <w:szCs w:val="24"/>
         </w:rPr>
-        <w:t>[[%</w:t>
-      </w:r>
-      <w:proofErr w:type="spellStart"/>
-      <w:r>
-        <w:rPr>
-          <w:rFonts w:asciiTheme="minorHAnsi" w:hAnsiTheme="minorHAnsi" w:cstheme="minorHAnsi"/>
-          <w:szCs w:val="24"/>
-        </w:rPr>
-        <w:t>img</w:t>
-      </w:r>
-      <w:proofErr w:type="spellEnd"/>
-      <w:r>
-        <w:rPr>
-          <w:rFonts w:asciiTheme="minorHAnsi" w:hAnsiTheme="minorHAnsi" w:cstheme="minorHAnsi"/>
-          <w:szCs w:val="24"/>
-        </w:rPr>
-        <w:t>{“</w:t>
-      </w:r>
-      <w:proofErr w:type="spellStart"/>
-      <w:r>
-        <w:rPr>
-          <w:rFonts w:asciiTheme="minorHAnsi" w:hAnsiTheme="minorHAnsi" w:cstheme="minorHAnsi"/>
-          <w:szCs w:val="24"/>
-        </w:rPr>
-        <w:t>path</w:t>
-      </w:r>
-      <w:proofErr w:type="spellEnd"/>
-      <w:r>
-        <w:rPr>
-          <w:rFonts w:asciiTheme="minorHAnsi" w:hAnsiTheme="minorHAnsi" w:cstheme="minorHAnsi"/>
-          <w:szCs w:val="24"/>
-        </w:rPr>
-        <w:t>“:“</w:t>
-      </w:r>
-      <w:proofErr w:type="spellStart"/>
-      <w:r>
-        <w:rPr>
-          <w:rFonts w:asciiTheme="minorHAnsi" w:hAnsiTheme="minorHAnsi" w:cstheme="minorHAnsi"/>
-          <w:szCs w:val="24"/>
-        </w:rPr>
-        <w:t>cenovy_odstup</w:t>
+        <w:t>[[%img</w:t>
+      </w:r>
+      <w:r>
+        <w:rPr>
+          <w:rFonts w:asciiTheme="minorHAnsi" w:hAnsiTheme="minorHAnsi" w:cstheme="minorHAnsi"/>
+          <w:szCs w:val="24"/>
+        </w:rPr>
+        <w:t>{“path“:“cenovy_odstup</w:t>
       </w:r>
       <w:r>
         <w:rPr>
@@ -5132,15 +4588,7 @@
           <w:rFonts w:asciiTheme="minorHAnsi" w:hAnsiTheme="minorHAnsi" w:cstheme="minorHAnsi"/>
           <w:szCs w:val="24"/>
         </w:rPr>
-        <w:t>_b</w:t>
-      </w:r>
-      <w:proofErr w:type="spellEnd"/>
-      <w:r>
-        <w:rPr>
-          <w:rFonts w:asciiTheme="minorHAnsi" w:hAnsiTheme="minorHAnsi" w:cstheme="minorHAnsi"/>
-          <w:szCs w:val="24"/>
-        </w:rPr>
-        <w:t>“}</w:t>
+        <w:t>_b“}</w:t>
       </w:r>
       <w:r>
         <w:rPr>
@@ -5181,15 +4629,20 @@
     </w:p>
     <w:p>
       <w:pPr>
-        <w:numPr>
-          <w:ilvl w:val="0"/>
-          <w:numId w:val="19"/>
-        </w:numPr>
+        <w:tabs>
+          <w:tab w:val="left" w:pos="1276"/>
+        </w:tabs>
         <w:suppressAutoHyphens w:val="0"/>
         <w:spacing w:before="120" w:after="120"/>
-        <w:ind w:left="1276"/>
+        <w:ind w:left="1276" w:hanging="709"/>
         <w:contextualSpacing/>
       </w:pPr>
+      <w:r>
+        <w:t>i)</w:t>
+      </w:r>
+      <w:r>
+        <w:tab/>
+      </w:r>
       <m:oMath>
         <m:sSubSup>
           <m:sSubSupPr>
@@ -5279,15 +4732,20 @@
     </w:p>
     <w:p>
       <w:pPr>
-        <w:numPr>
-          <w:ilvl w:val="0"/>
-          <w:numId w:val="19"/>
-        </w:numPr>
+        <w:tabs>
+          <w:tab w:val="left" w:pos="1276"/>
+        </w:tabs>
         <w:suppressAutoHyphens w:val="0"/>
         <w:spacing w:before="120" w:after="120"/>
-        <w:ind w:left="1276"/>
+        <w:ind w:left="1276" w:hanging="709"/>
         <w:contextualSpacing/>
       </w:pPr>
+      <w:r>
+        <w:t>ii)</w:t>
+      </w:r>
+      <w:r>
+        <w:tab/>
+      </w:r>
       <m:oMath>
         <m:sSubSup>
           <m:sSubSupPr>
@@ -5377,15 +4835,20 @@
     </w:p>
     <w:p>
       <w:pPr>
-        <w:numPr>
-          <w:ilvl w:val="0"/>
-          <w:numId w:val="19"/>
-        </w:numPr>
+        <w:tabs>
+          <w:tab w:val="left" w:pos="1276"/>
+        </w:tabs>
         <w:suppressAutoHyphens w:val="0"/>
         <w:spacing w:before="120" w:after="120"/>
-        <w:ind w:left="1276"/>
+        <w:ind w:left="1276" w:hanging="709"/>
         <w:contextualSpacing/>
       </w:pPr>
+      <w:r>
+        <w:t>iii)</w:t>
+      </w:r>
+      <w:r>
+        <w:tab/>
+      </w:r>
       <m:oMath>
         <m:sSubSup>
           <m:sSubSupPr>
@@ -5488,15 +4951,20 @@
     </w:p>
     <w:p>
       <w:pPr>
-        <w:numPr>
-          <w:ilvl w:val="0"/>
-          <w:numId w:val="20"/>
-        </w:numPr>
+        <w:tabs>
+          <w:tab w:val="left" w:pos="1276"/>
+        </w:tabs>
         <w:suppressAutoHyphens w:val="0"/>
         <w:spacing w:before="120" w:after="120"/>
-        <w:ind w:left="1276"/>
+        <w:ind w:left="1276" w:hanging="709"/>
         <w:contextualSpacing/>
       </w:pPr>
+      <w:r>
+        <w:t>i)</w:t>
+      </w:r>
+      <w:r>
+        <w:tab/>
+      </w:r>
       <m:oMath>
         <m:sSubSup>
           <m:sSubSupPr>
@@ -5586,15 +5054,20 @@
     </w:p>
     <w:p>
       <w:pPr>
-        <w:numPr>
-          <w:ilvl w:val="0"/>
-          <w:numId w:val="20"/>
-        </w:numPr>
+        <w:tabs>
+          <w:tab w:val="left" w:pos="1276"/>
+        </w:tabs>
         <w:suppressAutoHyphens w:val="0"/>
         <w:spacing w:before="120" w:after="120"/>
-        <w:ind w:left="1276"/>
+        <w:ind w:left="1276" w:hanging="709"/>
         <w:contextualSpacing/>
       </w:pPr>
+      <w:r>
+        <w:t>ii)</w:t>
+      </w:r>
+      <w:r>
+        <w:tab/>
+      </w:r>
       <m:oMath>
         <m:sSubSup>
           <m:sSubSupPr>
@@ -5684,14 +5157,19 @@
     </w:p>
     <w:p>
       <w:pPr>
-        <w:numPr>
-          <w:ilvl w:val="0"/>
-          <w:numId w:val="20"/>
-        </w:numPr>
+        <w:tabs>
+          <w:tab w:val="left" w:pos="1276"/>
+        </w:tabs>
         <w:suppressAutoHyphens w:val="0"/>
         <w:spacing w:after="120"/>
-        <w:ind w:left="1276"/>
-      </w:pPr>
+        <w:ind w:left="1276" w:hanging="709"/>
+      </w:pPr>
+      <w:r>
+        <w:t>iii)</w:t>
+      </w:r>
+      <w:r>
+        <w:tab/>
+      </w:r>
       <m:oMath>
         <m:sSubSup>
           <m:sSubSupPr>
@@ -5813,15 +5291,7 @@
         <w:spacing w:after="0"/>
       </w:pPr>
       <w:r>
-        <w:t xml:space="preserve">Souladnost cenových odstupů A </w:t>
-      </w:r>
-      <w:proofErr w:type="spellStart"/>
-      <w:r>
-        <w:t>a</w:t>
-      </w:r>
-      <w:proofErr w:type="spellEnd"/>
-      <w:r>
-        <w:t xml:space="preserve"> B vybraného produktu za vybrané období.</w:t>
+        <w:t>Souladnost cenových odstupů A a B vybraného produktu za vybrané období.</w:t>
       </w:r>
     </w:p>
     <w:p>
@@ -5836,55 +5306,23 @@
         <w:rPr>
           <w:rFonts w:asciiTheme="minorHAnsi" w:hAnsiTheme="minorHAnsi" w:cstheme="minorHAnsi"/>
           <w:szCs w:val="24"/>
-          <w:highlight w:val="yellow"/>
-        </w:rPr>
-        <w:t>[[%</w:t>
-      </w:r>
-      <w:proofErr w:type="spellStart"/>
-      <w:r>
-        <w:rPr>
-          <w:rFonts w:asciiTheme="minorHAnsi" w:hAnsiTheme="minorHAnsi" w:cstheme="minorHAnsi"/>
-          <w:szCs w:val="24"/>
-          <w:highlight w:val="yellow"/>
-        </w:rPr>
-        <w:t>img</w:t>
-      </w:r>
-      <w:proofErr w:type="spellEnd"/>
-      <w:r>
-        <w:t xml:space="preserve"> </w:t>
-      </w:r>
-      <w:r>
-        <w:rPr>
-          <w:rFonts w:asciiTheme="minorHAnsi" w:hAnsiTheme="minorHAnsi" w:cstheme="minorHAnsi"/>
-          <w:szCs w:val="24"/>
-        </w:rPr>
-        <w:t>{“</w:t>
-      </w:r>
-      <w:proofErr w:type="spellStart"/>
-      <w:r>
-        <w:rPr>
-          <w:rFonts w:asciiTheme="minorHAnsi" w:hAnsiTheme="minorHAnsi" w:cstheme="minorHAnsi"/>
-          <w:szCs w:val="24"/>
-        </w:rPr>
-        <w:t>path</w:t>
-      </w:r>
-      <w:proofErr w:type="spellEnd"/>
-      <w:r>
-        <w:rPr>
-          <w:rFonts w:asciiTheme="minorHAnsi" w:hAnsiTheme="minorHAnsi" w:cstheme="minorHAnsi"/>
-          <w:szCs w:val="24"/>
-        </w:rPr>
-        <w:t>“:“</w:t>
-      </w:r>
-      <w:proofErr w:type="spellStart"/>
-      <w:r>
-        <w:rPr>
-          <w:rFonts w:asciiTheme="minorHAnsi" w:hAnsiTheme="minorHAnsi" w:cstheme="minorHAnsi"/>
-          <w:szCs w:val="24"/>
-        </w:rPr>
-        <w:t>scatterplot_sladenost_cenovy_odstup_b</w:t>
-      </w:r>
-      <w:proofErr w:type="spellEnd"/>
+        </w:rPr>
+        <w:t>[[%img</w:t>
+      </w:r>
+      <w:r>
+        <w:rPr>
+          <w:rFonts w:asciiTheme="minorHAnsi" w:hAnsiTheme="minorHAnsi" w:cstheme="minorHAnsi"/>
+          <w:szCs w:val="24"/>
+        </w:rPr>
+        <w:t>{“path“:“</w:t>
+      </w:r>
+      <w:r>
+        <w:rPr>
+          <w:rFonts w:asciiTheme="minorHAnsi" w:hAnsiTheme="minorHAnsi" w:cstheme="minorHAnsi"/>
+          <w:szCs w:val="24"/>
+        </w:rPr>
+        <w:t>souladnost_cenovych_odstupu</w:t>
+      </w:r>
       <w:r>
         <w:rPr>
           <w:rFonts w:asciiTheme="minorHAnsi" w:hAnsiTheme="minorHAnsi" w:cstheme="minorHAnsi"/>
@@ -5896,7 +5334,6 @@
         <w:rPr>
           <w:rFonts w:asciiTheme="minorHAnsi" w:hAnsiTheme="minorHAnsi" w:cstheme="minorHAnsi"/>
           <w:szCs w:val="24"/>
-          <w:highlight w:val="yellow"/>
         </w:rPr>
         <w:t>]]</w:t>
       </w:r>
@@ -6190,165 +5627,248 @@
       <w:r>
         <w:t xml:space="preserve">i </w:t>
       </w:r>
+      <m:oMath>
+        <m:r>
+          <w:rPr>
+            <w:rFonts w:ascii="Cambria Math" w:hAnsi="Cambria Math"/>
+          </w:rPr>
+          <m:t xml:space="preserve">α= </m:t>
+        </m:r>
+      </m:oMath>
+      <w:r>
+        <w:rPr>
+          <w:b/>
+          <w:bCs/>
+        </w:rPr>
+        <w:t xml:space="preserve"> </w:t>
+      </w:r>
+      <w:r>
+        <w:rPr>
+          <w:b/>
+          <w:bCs/>
+        </w:rPr>
+        <w:t>[[#reg</w:t>
+      </w:r>
+      <w:r>
+        <w:rPr>
+          <w:b/>
+          <w:bCs/>
+        </w:rPr>
+        <w:t>_dA_dB</w:t>
+      </w:r>
+      <w:proofErr w:type="gramStart"/>
+      <w:r>
+        <w:rPr>
+          <w:b/>
+          <w:bCs/>
+        </w:rPr>
+        <w:t>]][</w:t>
+      </w:r>
+      <w:proofErr w:type="gramEnd"/>
+      <w:r>
+        <w:rPr>
+          <w:b/>
+          <w:bCs/>
+        </w:rPr>
+        <w:t>[p_value</w:t>
+      </w:r>
+      <w:proofErr w:type="gramStart"/>
+      <w:r>
+        <w:rPr>
+          <w:b/>
+          <w:bCs/>
+        </w:rPr>
+        <w:t>]][</w:t>
+      </w:r>
+      <w:proofErr w:type="gramEnd"/>
+      <w:r>
+        <w:rPr>
+          <w:b/>
+          <w:bCs/>
+        </w:rPr>
+        <w:t>[/reg</w:t>
+      </w:r>
+      <w:r>
+        <w:rPr>
+          <w:b/>
+          <w:bCs/>
+        </w:rPr>
+        <w:t>_dA_dB</w:t>
+      </w:r>
+      <w:r>
+        <w:rPr>
+          <w:b/>
+          <w:bCs/>
+        </w:rPr>
+        <w:t>]]</w:t>
+      </w:r>
+      <w:r>
+        <w:t xml:space="preserve">, že </w:t>
+      </w:r>
+      <w:r>
+        <w:t>vzájemn</w:t>
+      </w:r>
+      <w:r>
+        <w:t>á</w:t>
+      </w:r>
+      <w:r>
+        <w:t xml:space="preserve"> citlivost cenových odstupů</w:t>
+      </w:r>
+      <w:r>
+        <w:t xml:space="preserve"> (</w:t>
+      </w:r>
       <w:r>
         <w:rPr>
           <w:rFonts w:cs="Calibri"/>
         </w:rPr>
-        <w:t>α</w:t>
-      </w:r>
-      <w:r>
-        <w:rPr>
-          <w:lang w:val="en-US"/>
-        </w:rPr>
-        <w:t xml:space="preserve"> = [</w:t>
-      </w:r>
-      <w:r>
-        <w:rPr>
-          <w:lang w:val="en-US"/>
-        </w:rPr>
-        <w:t>[#reg1</w:t>
+        <w:t>δ</w:t>
+      </w:r>
+      <w:r>
+        <w:t>)</w:t>
+      </w:r>
+      <w:r>
+        <w:t xml:space="preserve"> byla ve vybraném období </w:t>
+      </w:r>
+      <w:r>
+        <w:rPr>
+          <w:b/>
+          <w:bCs/>
+        </w:rPr>
+        <w:t>[[#reg</w:t>
+      </w:r>
+      <w:r>
+        <w:rPr>
+          <w:b/>
+          <w:bCs/>
+        </w:rPr>
+        <w:t>_dA_dB</w:t>
       </w:r>
       <w:proofErr w:type="gramStart"/>
       <w:r>
         <w:rPr>
-          <w:lang w:val="en-US"/>
+          <w:b/>
+          <w:bCs/>
         </w:rPr>
         <w:t>]][</w:t>
       </w:r>
       <w:proofErr w:type="gramEnd"/>
       <w:r>
         <w:rPr>
-          <w:lang w:val="en-US"/>
-        </w:rPr>
-        <w:t>[p_value</w:t>
+          <w:b/>
+          <w:bCs/>
+        </w:rPr>
+        <w:t>[beta_</w:t>
+      </w:r>
+      <w:r>
+        <w:rPr>
+          <w:b/>
+          <w:bCs/>
+        </w:rPr>
+        <w:t>dB</w:t>
       </w:r>
       <w:proofErr w:type="gramStart"/>
       <w:r>
         <w:rPr>
-          <w:lang w:val="en-US"/>
+          <w:b/>
+          <w:bCs/>
         </w:rPr>
         <w:t>]][</w:t>
       </w:r>
       <w:proofErr w:type="gramEnd"/>
       <w:r>
         <w:rPr>
-          <w:lang w:val="en-US"/>
-        </w:rPr>
-        <w:t>[/reg1]]</w:t>
-      </w:r>
-      <w:r>
-        <w:t xml:space="preserve">, že </w:t>
-      </w:r>
-      <w:r>
-        <w:t>vzájemn</w:t>
-      </w:r>
-      <w:r>
-        <w:t>á</w:t>
-      </w:r>
-      <w:r>
-        <w:t xml:space="preserve"> citlivost cenových odstupů</w:t>
-      </w:r>
-      <w:r>
-        <w:t xml:space="preserve"> (</w:t>
-      </w:r>
-      <w:r>
-        <w:rPr>
-          <w:rFonts w:cs="Calibri"/>
-        </w:rPr>
-        <w:t>δ</w:t>
-      </w:r>
-      <w:r>
-        <w:t>)</w:t>
-      </w:r>
-      <w:r>
-        <w:t xml:space="preserve"> byla ve vybraném období </w:t>
-      </w:r>
-      <w:r>
-        <w:rPr>
-          <w:lang w:val="en-US"/>
-        </w:rPr>
-        <w:t>[[#reg1</w:t>
+          <w:b/>
+          <w:bCs/>
+        </w:rPr>
+        <w:t>[/reg</w:t>
+      </w:r>
+      <w:r>
+        <w:rPr>
+          <w:b/>
+          <w:bCs/>
+        </w:rPr>
+        <w:t>_dA_dB</w:t>
+      </w:r>
+      <w:r>
+        <w:rPr>
+          <w:b/>
+          <w:bCs/>
+        </w:rPr>
+        <w:t>]]</w:t>
+      </w:r>
+      <w:r>
+        <w:rPr>
+          <w:rFonts w:asciiTheme="minorHAnsi" w:hAnsiTheme="minorHAnsi" w:cstheme="minorHAnsi"/>
+          <w:szCs w:val="24"/>
+        </w:rPr>
+        <w:t xml:space="preserve"> se směrodatnou chybou</w:t>
+      </w:r>
+      <w:r>
+        <w:rPr>
+          <w:rFonts w:asciiTheme="minorHAnsi" w:hAnsiTheme="minorHAnsi" w:cstheme="minorHAnsi"/>
+          <w:szCs w:val="24"/>
+        </w:rPr>
+        <w:t xml:space="preserve"> </w:t>
+      </w:r>
+      <w:r>
+        <w:rPr>
+          <w:b/>
+          <w:bCs/>
+        </w:rPr>
+        <w:t>[[#reg</w:t>
+      </w:r>
+      <w:r>
+        <w:rPr>
+          <w:b/>
+          <w:bCs/>
+        </w:rPr>
+        <w:t>_dA_dB</w:t>
       </w:r>
       <w:proofErr w:type="gramStart"/>
       <w:r>
         <w:rPr>
-          <w:lang w:val="en-US"/>
+          <w:b/>
+          <w:bCs/>
         </w:rPr>
         <w:t>]][</w:t>
       </w:r>
       <w:proofErr w:type="gramEnd"/>
       <w:r>
         <w:rPr>
-          <w:lang w:val="en-US"/>
-        </w:rPr>
-        <w:t>[</w:t>
-      </w:r>
-      <w:r>
-        <w:rPr>
-          <w:lang w:val="en-US"/>
-        </w:rPr>
-        <w:t>beta_Np</w:t>
+          <w:b/>
+          <w:bCs/>
+        </w:rPr>
+        <w:t>[beta_SE</w:t>
       </w:r>
       <w:proofErr w:type="gramStart"/>
       <w:r>
         <w:rPr>
-          <w:lang w:val="en-US"/>
+          <w:b/>
+          <w:bCs/>
         </w:rPr>
         <w:t>]][</w:t>
       </w:r>
       <w:proofErr w:type="gramEnd"/>
       <w:r>
         <w:rPr>
-          <w:lang w:val="en-US"/>
-        </w:rPr>
-        <w:t>[/reg1]]</w:t>
-      </w:r>
-      <w:r>
-        <w:rPr>
-          <w:rFonts w:asciiTheme="minorHAnsi" w:hAnsiTheme="minorHAnsi" w:cstheme="minorHAnsi"/>
-          <w:szCs w:val="24"/>
-        </w:rPr>
-        <w:t xml:space="preserve"> se směrodatnou chybou </w:t>
-      </w:r>
-      <w:r>
-        <w:rPr>
-          <w:lang w:val="en-US"/>
-        </w:rPr>
-        <w:t>[[#reg1</w:t>
-      </w:r>
-      <w:proofErr w:type="gramStart"/>
-      <w:r>
-        <w:rPr>
-          <w:lang w:val="en-US"/>
-        </w:rPr>
-        <w:t>]][</w:t>
-      </w:r>
-      <w:proofErr w:type="gramEnd"/>
-      <w:r>
-        <w:rPr>
-          <w:lang w:val="en-US"/>
-        </w:rPr>
-        <w:t>[</w:t>
-      </w:r>
-      <w:r>
-        <w:rPr>
-          <w:lang w:val="en-US"/>
-        </w:rPr>
-        <w:t>beta_SE</w:t>
-      </w:r>
-      <w:proofErr w:type="gramStart"/>
-      <w:r>
-        <w:rPr>
-          <w:lang w:val="en-US"/>
-        </w:rPr>
-        <w:t>]][</w:t>
-      </w:r>
-      <w:proofErr w:type="gramEnd"/>
-      <w:r>
-        <w:rPr>
-          <w:lang w:val="en-US"/>
-        </w:rPr>
-        <w:t>[/reg1]]</w:t>
+          <w:b/>
+          <w:bCs/>
+        </w:rPr>
+        <w:t>[/reg</w:t>
+      </w:r>
+      <w:r>
+        <w:rPr>
+          <w:b/>
+          <w:bCs/>
+        </w:rPr>
+        <w:t>_dA_dB</w:t>
+      </w:r>
+      <w:r>
+        <w:rPr>
+          <w:b/>
+          <w:bCs/>
+        </w:rPr>
+        <w:t>]]</w:t>
       </w:r>
       <w:r>
         <w:rPr>
@@ -6408,27 +5928,7 @@
           <w:szCs w:val="28"/>
         </w:rPr>
         <w:lastRenderedPageBreak/>
-        <w:t>[[</w:t>
-      </w:r>
-      <w:proofErr w:type="spellStart"/>
-      <w:r>
-        <w:rPr>
-          <w:rFonts w:asciiTheme="minorHAnsi" w:hAnsiTheme="minorHAnsi" w:cstheme="minorHAnsi"/>
-          <w:b/>
-          <w:bCs/>
-          <w:szCs w:val="28"/>
-        </w:rPr>
-        <w:t>name</w:t>
-      </w:r>
-      <w:proofErr w:type="spellEnd"/>
-      <w:r>
-        <w:rPr>
-          <w:rFonts w:asciiTheme="minorHAnsi" w:hAnsiTheme="minorHAnsi" w:cstheme="minorHAnsi"/>
-          <w:b/>
-          <w:bCs/>
-          <w:szCs w:val="28"/>
-        </w:rPr>
-        <w:t>]]</w:t>
+        <w:t>[[name]]</w:t>
       </w:r>
     </w:p>
     <w:p>
@@ -6874,15 +6374,7 @@
         </w:rPr>
       </w:pPr>
       <w:r>
-        <w:t>Následující graf zobrazuje vývoj indexu sladění cen (</w:t>
-      </w:r>
-      <w:proofErr w:type="spellStart"/>
-      <w:r>
-        <w:t>iB</w:t>
-      </w:r>
-      <w:proofErr w:type="spellEnd"/>
-      <w:r>
-        <w:t>).</w:t>
+        <w:t>Následující graf zobrazuje vývoj indexu sladění cen (iB).</w:t>
       </w:r>
     </w:p>
     <w:p>
@@ -6907,55 +6399,14 @@
           <w:rFonts w:asciiTheme="minorHAnsi" w:hAnsiTheme="minorHAnsi" w:cstheme="minorHAnsi"/>
           <w:szCs w:val="24"/>
         </w:rPr>
-        <w:t>[[%</w:t>
-      </w:r>
-      <w:proofErr w:type="spellStart"/>
-      <w:r>
-        <w:rPr>
-          <w:rFonts w:asciiTheme="minorHAnsi" w:hAnsiTheme="minorHAnsi" w:cstheme="minorHAnsi"/>
-          <w:szCs w:val="24"/>
-        </w:rPr>
-        <w:t>img</w:t>
-      </w:r>
-      <w:proofErr w:type="spellEnd"/>
-      <w:r>
-        <w:rPr>
-          <w:rFonts w:asciiTheme="minorHAnsi" w:hAnsiTheme="minorHAnsi" w:cstheme="minorHAnsi"/>
-          <w:szCs w:val="24"/>
-        </w:rPr>
-        <w:t>{“</w:t>
-      </w:r>
-      <w:proofErr w:type="spellStart"/>
-      <w:r>
-        <w:rPr>
-          <w:rFonts w:asciiTheme="minorHAnsi" w:hAnsiTheme="minorHAnsi" w:cstheme="minorHAnsi"/>
-          <w:szCs w:val="24"/>
-        </w:rPr>
-        <w:t>path</w:t>
-      </w:r>
-      <w:proofErr w:type="spellEnd"/>
-      <w:r>
-        <w:rPr>
-          <w:rFonts w:asciiTheme="minorHAnsi" w:hAnsiTheme="minorHAnsi" w:cstheme="minorHAnsi"/>
-          <w:szCs w:val="24"/>
-        </w:rPr>
-        <w:t>“:“</w:t>
-      </w:r>
-      <w:proofErr w:type="spellStart"/>
-      <w:r>
-        <w:rPr>
-          <w:rFonts w:asciiTheme="minorHAnsi" w:hAnsiTheme="minorHAnsi" w:cstheme="minorHAnsi"/>
-          <w:szCs w:val="24"/>
-        </w:rPr>
-        <w:t>index_sladeni</w:t>
-      </w:r>
-      <w:proofErr w:type="spellEnd"/>
-      <w:r>
-        <w:rPr>
-          <w:rFonts w:asciiTheme="minorHAnsi" w:hAnsiTheme="minorHAnsi" w:cstheme="minorHAnsi"/>
-          <w:szCs w:val="24"/>
-        </w:rPr>
-        <w:t>“}</w:t>
+        <w:t>[[%img</w:t>
+      </w:r>
+      <w:r>
+        <w:rPr>
+          <w:rFonts w:asciiTheme="minorHAnsi" w:hAnsiTheme="minorHAnsi" w:cstheme="minorHAnsi"/>
+          <w:szCs w:val="24"/>
+        </w:rPr>
+        <w:t>{“path“:“index_sladeni“}</w:t>
       </w:r>
       <w:r>
         <w:rPr>
@@ -7002,15 +6453,20 @@
     </w:p>
     <w:p>
       <w:pPr>
-        <w:numPr>
-          <w:ilvl w:val="0"/>
-          <w:numId w:val="21"/>
-        </w:numPr>
+        <w:tabs>
+          <w:tab w:val="left" w:pos="1276"/>
+        </w:tabs>
         <w:suppressAutoHyphens w:val="0"/>
         <w:spacing w:before="120" w:after="120"/>
-        <w:ind w:left="1276"/>
+        <w:ind w:left="1276" w:hanging="709"/>
         <w:contextualSpacing/>
       </w:pPr>
+      <w:r>
+        <w:t>i)</w:t>
+      </w:r>
+      <w:r>
+        <w:tab/>
+      </w:r>
       <m:oMath>
         <m:sSubSup>
           <m:sSubSupPr>
@@ -7077,15 +6533,20 @@
     </w:p>
     <w:p>
       <w:pPr>
-        <w:numPr>
-          <w:ilvl w:val="0"/>
-          <w:numId w:val="21"/>
-        </w:numPr>
+        <w:tabs>
+          <w:tab w:val="left" w:pos="1276"/>
+        </w:tabs>
         <w:suppressAutoHyphens w:val="0"/>
         <w:spacing w:before="120" w:after="120"/>
-        <w:ind w:left="1276"/>
+        <w:ind w:left="1276" w:hanging="709"/>
         <w:contextualSpacing/>
       </w:pPr>
+      <w:r>
+        <w:t>ii)</w:t>
+      </w:r>
+      <w:r>
+        <w:tab/>
+      </w:r>
       <m:oMath>
         <m:sSubSup>
           <m:sSubSupPr>
@@ -7167,14 +6628,19 @@
     </w:p>
     <w:p>
       <w:pPr>
-        <w:numPr>
-          <w:ilvl w:val="0"/>
-          <w:numId w:val="21"/>
-        </w:numPr>
+        <w:tabs>
+          <w:tab w:val="left" w:pos="1276"/>
+        </w:tabs>
         <w:suppressAutoHyphens w:val="0"/>
         <w:spacing w:after="120"/>
-        <w:ind w:left="1276"/>
-      </w:pPr>
+        <w:ind w:left="1276" w:hanging="709"/>
+      </w:pPr>
+      <w:r>
+        <w:t>iii)</w:t>
+      </w:r>
+      <w:r>
+        <w:tab/>
+      </w:r>
       <m:oMath>
         <m:sSubSup>
           <m:sSubSupPr>
@@ -7404,42 +6870,15 @@
           <w:szCs w:val="24"/>
           <w:highlight w:val="yellow"/>
         </w:rPr>
-        <w:t>[[%</w:t>
-      </w:r>
-      <w:proofErr w:type="spellStart"/>
-      <w:r>
-        <w:rPr>
-          <w:rFonts w:asciiTheme="minorHAnsi" w:hAnsiTheme="minorHAnsi" w:cstheme="minorHAnsi"/>
-          <w:szCs w:val="24"/>
-          <w:highlight w:val="yellow"/>
-        </w:rPr>
-        <w:t>img</w:t>
-      </w:r>
-      <w:proofErr w:type="spellEnd"/>
-      <w:r>
-        <w:rPr>
-          <w:rFonts w:asciiTheme="minorHAnsi" w:hAnsiTheme="minorHAnsi" w:cstheme="minorHAnsi"/>
-          <w:szCs w:val="24"/>
-        </w:rPr>
-        <w:t>{“</w:t>
-      </w:r>
-      <w:proofErr w:type="spellStart"/>
-      <w:r>
-        <w:rPr>
-          <w:rFonts w:asciiTheme="minorHAnsi" w:hAnsiTheme="minorHAnsi" w:cstheme="minorHAnsi"/>
-          <w:szCs w:val="24"/>
-        </w:rPr>
-        <w:t>path</w:t>
-      </w:r>
-      <w:proofErr w:type="spellEnd"/>
-      <w:r>
-        <w:rPr>
-          <w:rFonts w:asciiTheme="minorHAnsi" w:hAnsiTheme="minorHAnsi" w:cstheme="minorHAnsi"/>
-          <w:szCs w:val="24"/>
-        </w:rPr>
-        <w:t>“:“</w:t>
-      </w:r>
-      <w:proofErr w:type="spellStart"/>
+        <w:t>[[%img</w:t>
+      </w:r>
+      <w:r>
+        <w:rPr>
+          <w:rFonts w:asciiTheme="minorHAnsi" w:hAnsiTheme="minorHAnsi" w:cstheme="minorHAnsi"/>
+          <w:szCs w:val="24"/>
+        </w:rPr>
+        <w:t>{“path“:“</w:t>
+      </w:r>
       <w:r>
         <w:rPr>
           <w:rFonts w:asciiTheme="minorHAnsi" w:hAnsiTheme="minorHAnsi" w:cstheme="minorHAnsi"/>
@@ -7447,7 +6886,6 @@
         </w:rPr>
         <w:t>scatterplot_iP_Np</w:t>
       </w:r>
-      <w:proofErr w:type="spellEnd"/>
       <w:r>
         <w:rPr>
           <w:rFonts w:asciiTheme="minorHAnsi" w:hAnsiTheme="minorHAnsi" w:cstheme="minorHAnsi"/>
@@ -7507,16 +6945,10 @@
         </m:r>
       </m:oMath>
       <w:r>
-        <w:t>)</w:t>
-      </w:r>
-      <w:r>
-        <w:rPr>
-          <w:vertAlign w:val="superscript"/>
-        </w:rPr>
-        <w:footnoteReference w:id="2"/>
-      </w:r>
-      <w:r>
-        <w:t xml:space="preserve"> jako:</w:t>
+        <w:t xml:space="preserve"> omikron</w:t>
+      </w:r>
+      <w:r>
+        <w:t>) jako:</w:t>
       </w:r>
     </w:p>
     <w:p>
@@ -7739,7 +7171,6 @@
         </w:rPr>
       </w:pPr>
       <w:r>
-        <w:lastRenderedPageBreak/>
         <w:t xml:space="preserve">Analýzou bylo zjištěno na hladině statistické významnosti </w:t>
       </w:r>
       <m:oMath>
@@ -7755,14 +7186,42 @@
       </w:r>
       <w:r>
         <w:rPr>
-          <w:rFonts w:asciiTheme="minorHAnsi" w:hAnsiTheme="minorHAnsi" w:cstheme="minorHAnsi"/>
           <w:b/>
           <w:bCs/>
-          <w:i/>
-          <w:iCs/>
-          <w:szCs w:val="24"/>
-        </w:rPr>
-        <w:t>[XXX]</w:t>
+        </w:rPr>
+        <w:t>[[#reg1</w:t>
+      </w:r>
+      <w:proofErr w:type="gramStart"/>
+      <w:r>
+        <w:rPr>
+          <w:b/>
+          <w:bCs/>
+        </w:rPr>
+        <w:t>]][</w:t>
+      </w:r>
+      <w:proofErr w:type="gramEnd"/>
+      <w:r>
+        <w:rPr>
+          <w:b/>
+          <w:bCs/>
+        </w:rPr>
+        <w:t>[p_value</w:t>
+      </w:r>
+      <w:proofErr w:type="gramStart"/>
+      <w:r>
+        <w:rPr>
+          <w:b/>
+          <w:bCs/>
+        </w:rPr>
+        <w:t>]][</w:t>
+      </w:r>
+      <w:proofErr w:type="gramEnd"/>
+      <w:r>
+        <w:rPr>
+          <w:b/>
+          <w:bCs/>
+        </w:rPr>
+        <w:t>[/reg1]]</w:t>
       </w:r>
       <w:r>
         <w:t>, že hodnota efektu odepření dodávek</w:t>
@@ -7792,28 +7251,88 @@
       </w:r>
       <w:r>
         <w:rPr>
-          <w:rFonts w:asciiTheme="minorHAnsi" w:hAnsiTheme="minorHAnsi" w:cstheme="minorHAnsi"/>
           <w:b/>
           <w:bCs/>
-          <w:szCs w:val="24"/>
-        </w:rPr>
-        <w:t>[XX]</w:t>
-      </w:r>
-      <w:r>
-        <w:rPr>
-          <w:rFonts w:asciiTheme="minorHAnsi" w:hAnsiTheme="minorHAnsi" w:cstheme="minorHAnsi"/>
-          <w:szCs w:val="24"/>
-        </w:rPr>
-        <w:t xml:space="preserve"> se směrodatnou chybou </w:t>
-      </w:r>
-      <w:r>
-        <w:rPr>
-          <w:rFonts w:asciiTheme="minorHAnsi" w:hAnsiTheme="minorHAnsi" w:cstheme="minorHAnsi"/>
+        </w:rPr>
+        <w:t>[[#reg1</w:t>
+      </w:r>
+      <w:proofErr w:type="gramStart"/>
+      <w:r>
+        <w:rPr>
           <w:b/>
           <w:bCs/>
-          <w:szCs w:val="24"/>
-        </w:rPr>
-        <w:t>[XX]</w:t>
+        </w:rPr>
+        <w:t>]][</w:t>
+      </w:r>
+      <w:proofErr w:type="gramEnd"/>
+      <w:r>
+        <w:rPr>
+          <w:b/>
+          <w:bCs/>
+        </w:rPr>
+        <w:t>[beta_Np</w:t>
+      </w:r>
+      <w:proofErr w:type="gramStart"/>
+      <w:r>
+        <w:rPr>
+          <w:b/>
+          <w:bCs/>
+        </w:rPr>
+        <w:t>]][</w:t>
+      </w:r>
+      <w:proofErr w:type="gramEnd"/>
+      <w:r>
+        <w:rPr>
+          <w:b/>
+          <w:bCs/>
+        </w:rPr>
+        <w:t>[/reg1]]</w:t>
+      </w:r>
+      <w:r>
+        <w:rPr>
+          <w:rFonts w:asciiTheme="minorHAnsi" w:hAnsiTheme="minorHAnsi" w:cstheme="minorHAnsi"/>
+          <w:szCs w:val="24"/>
+        </w:rPr>
+        <w:t xml:space="preserve"> se směrodatnou chybou </w:t>
+      </w:r>
+      <w:r>
+        <w:rPr>
+          <w:b/>
+          <w:bCs/>
+        </w:rPr>
+        <w:t>[[#reg1</w:t>
+      </w:r>
+      <w:proofErr w:type="gramStart"/>
+      <w:r>
+        <w:rPr>
+          <w:b/>
+          <w:bCs/>
+        </w:rPr>
+        <w:t>]][</w:t>
+      </w:r>
+      <w:proofErr w:type="gramEnd"/>
+      <w:r>
+        <w:rPr>
+          <w:b/>
+          <w:bCs/>
+        </w:rPr>
+        <w:t>[beta_SE</w:t>
+      </w:r>
+      <w:proofErr w:type="gramStart"/>
+      <w:r>
+        <w:rPr>
+          <w:b/>
+          <w:bCs/>
+        </w:rPr>
+        <w:t>]][</w:t>
+      </w:r>
+      <w:proofErr w:type="gramEnd"/>
+      <w:r>
+        <w:rPr>
+          <w:b/>
+          <w:bCs/>
+        </w:rPr>
+        <w:t>[/reg1]]</w:t>
       </w:r>
       <w:r>
         <w:rPr>
@@ -7836,6 +7355,7 @@
           <w:rFonts w:asciiTheme="minorHAnsi" w:hAnsiTheme="minorHAnsi" w:cstheme="minorHAnsi"/>
           <w:szCs w:val="24"/>
         </w:rPr>
+        <w:lastRenderedPageBreak/>
         <w:br w:type="page"/>
       </w:r>
     </w:p>
@@ -7857,58 +7377,27 @@
           <w:szCs w:val="28"/>
         </w:rPr>
         <w:lastRenderedPageBreak/>
-        <w:t>[[</w:t>
-      </w:r>
-      <w:proofErr w:type="spellStart"/>
-      <w:r>
+        <w:t>[[name]]</w:t>
+      </w:r>
+    </w:p>
+    <w:p>
+      <w:pPr>
+        <w:spacing w:before="120" w:after="120"/>
         <w:rPr>
           <w:rFonts w:asciiTheme="minorHAnsi" w:hAnsiTheme="minorHAnsi" w:cstheme="minorHAnsi"/>
           <w:b/>
           <w:bCs/>
-          <w:szCs w:val="28"/>
-        </w:rPr>
-        <w:t>name</w:t>
-      </w:r>
-      <w:proofErr w:type="spellEnd"/>
+          <w:szCs w:val="24"/>
+        </w:rPr>
+      </w:pPr>
       <w:r>
         <w:rPr>
           <w:rFonts w:asciiTheme="minorHAnsi" w:hAnsiTheme="minorHAnsi" w:cstheme="minorHAnsi"/>
           <w:b/>
           <w:bCs/>
-          <w:szCs w:val="28"/>
-        </w:rPr>
-        <w:t>]]</w:t>
-      </w:r>
-    </w:p>
-    <w:p>
-      <w:pPr>
-        <w:spacing w:before="120" w:after="120"/>
-        <w:rPr>
-          <w:rFonts w:asciiTheme="minorHAnsi" w:hAnsiTheme="minorHAnsi" w:cstheme="minorHAnsi"/>
-          <w:b/>
-          <w:bCs/>
-          <w:szCs w:val="24"/>
-        </w:rPr>
-      </w:pPr>
-      <w:proofErr w:type="spellStart"/>
-      <w:r>
-        <w:rPr>
-          <w:rFonts w:asciiTheme="minorHAnsi" w:hAnsiTheme="minorHAnsi" w:cstheme="minorHAnsi"/>
-          <w:b/>
-          <w:bCs/>
-          <w:szCs w:val="24"/>
-        </w:rPr>
-        <w:t>Entropizace</w:t>
-      </w:r>
-      <w:proofErr w:type="spellEnd"/>
-      <w:r>
-        <w:rPr>
-          <w:rFonts w:asciiTheme="minorHAnsi" w:hAnsiTheme="minorHAnsi" w:cstheme="minorHAnsi"/>
-          <w:b/>
-          <w:bCs/>
-          <w:szCs w:val="24"/>
-        </w:rPr>
-        <w:t xml:space="preserve"> cen</w:t>
+          <w:szCs w:val="24"/>
+        </w:rPr>
+        <w:t>Entropizace cen</w:t>
       </w:r>
       <w:r>
         <w:rPr>
@@ -7963,16 +7452,7 @@
         </m:r>
       </m:oMath>
       <w:r>
-        <w:t xml:space="preserve"> vypočten index entropizace</w:t>
-      </w:r>
-      <w:r>
-        <w:rPr>
-          <w:vertAlign w:val="superscript"/>
-        </w:rPr>
-        <w:footnoteReference w:id="3"/>
-      </w:r>
-      <w:r>
-        <w:t xml:space="preserve"> cen (</w:t>
+        <w:t xml:space="preserve"> vypočten index entropizace cen (</w:t>
       </w:r>
       <m:oMath>
         <m:sSubSup>
@@ -8172,6 +7652,12 @@
       <w:r>
         <w:t xml:space="preserve"> než jedna vyjadřuje rostoucí „uspořádanost“ pozorovaných cen.</w:t>
       </w:r>
+      <w:r>
+        <w:t xml:space="preserve"> </w:t>
+      </w:r>
+      <w:r>
+        <w:t>Entropie vyjadřuje míru neuspořádanosti zkoumaného systému. V analyzovaných podmínkách platí, že tržní situace vzniklá z nezávislého jednání tržních subjektů bude vykazovat relativně vyšší entropii, tj. neuspořádanost. Na druhou stranu se zásah „zvenčí“ projeví rostoucí mírou uspořádání (sladěním cen), a tedy nižší entropií.</w:t>
+      </w:r>
     </w:p>
     <w:p>
       <w:pPr>
@@ -8180,35 +7666,23 @@
       <w:r>
         <w:t xml:space="preserve">Následující graf zobrazuje vývoj </w:t>
       </w:r>
-      <w:proofErr w:type="spellStart"/>
       <w:r>
         <w:t>entropizace</w:t>
       </w:r>
-      <w:proofErr w:type="spellEnd"/>
       <w:r>
         <w:t xml:space="preserve"> cen (</w:t>
       </w:r>
-      <w:proofErr w:type="spellStart"/>
       <w:r>
         <w:t>d</w:t>
       </w:r>
       <w:r>
-        <w:t>iB</w:t>
-      </w:r>
-      <w:proofErr w:type="spellEnd"/>
-      <w:r>
-        <w:t>)</w:t>
+        <w:t>iB)</w:t>
       </w:r>
       <w:r>
         <w:t xml:space="preserve"> a její vypočtenou průměrnou hodnotu (</w:t>
       </w:r>
-      <w:proofErr w:type="spellStart"/>
-      <w:r>
-        <w:t>avg_diB</w:t>
-      </w:r>
-      <w:proofErr w:type="spellEnd"/>
-      <w:r>
-        <w:t>)</w:t>
+      <w:r>
+        <w:t>avg_diB)</w:t>
       </w:r>
       <w:r>
         <w:t xml:space="preserve"> získanou jako:</w:t>
@@ -8361,15 +7835,20 @@
     </w:p>
     <w:p>
       <w:pPr>
-        <w:numPr>
-          <w:ilvl w:val="0"/>
-          <w:numId w:val="22"/>
-        </w:numPr>
+        <w:tabs>
+          <w:tab w:val="left" w:pos="1276"/>
+        </w:tabs>
         <w:suppressAutoHyphens w:val="0"/>
         <w:spacing w:before="120" w:after="120"/>
-        <w:ind w:left="1276"/>
+        <w:ind w:left="1276" w:hanging="709"/>
         <w:contextualSpacing/>
       </w:pPr>
+      <w:r>
+        <w:t>i)</w:t>
+      </w:r>
+      <w:r>
+        <w:tab/>
+      </w:r>
       <m:oMath>
         <m:sSubSup>
           <m:sSubSupPr>
@@ -8418,15 +7897,20 @@
     </w:p>
     <w:p>
       <w:pPr>
-        <w:numPr>
-          <w:ilvl w:val="0"/>
-          <w:numId w:val="22"/>
-        </w:numPr>
+        <w:tabs>
+          <w:tab w:val="left" w:pos="1276"/>
+        </w:tabs>
         <w:suppressAutoHyphens w:val="0"/>
         <w:spacing w:before="120" w:after="120"/>
-        <w:ind w:left="1276"/>
+        <w:ind w:left="1276" w:hanging="709"/>
         <w:contextualSpacing/>
       </w:pPr>
+      <w:r>
+        <w:t>ii)</w:t>
+      </w:r>
+      <w:r>
+        <w:tab/>
+      </w:r>
       <m:oMath>
         <m:sSubSup>
           <m:sSubSupPr>
@@ -8481,11 +7965,9 @@
       <w:r>
         <w:t xml:space="preserve">Vývoj </w:t>
       </w:r>
-      <w:proofErr w:type="spellStart"/>
       <w:r>
         <w:t>entropizace</w:t>
       </w:r>
-      <w:proofErr w:type="spellEnd"/>
       <w:r>
         <w:t xml:space="preserve"> cen vybraného produktu za vybrané období.</w:t>
       </w:r>
@@ -8503,41 +7985,15 @@
           <w:rFonts w:asciiTheme="minorHAnsi" w:hAnsiTheme="minorHAnsi" w:cstheme="minorHAnsi"/>
           <w:szCs w:val="24"/>
         </w:rPr>
-        <w:t>[[%</w:t>
-      </w:r>
-      <w:proofErr w:type="spellStart"/>
-      <w:r>
-        <w:rPr>
-          <w:rFonts w:asciiTheme="minorHAnsi" w:hAnsiTheme="minorHAnsi" w:cstheme="minorHAnsi"/>
-          <w:szCs w:val="24"/>
-        </w:rPr>
-        <w:t>img</w:t>
-      </w:r>
-      <w:proofErr w:type="spellEnd"/>
-      <w:r>
-        <w:rPr>
-          <w:rFonts w:asciiTheme="minorHAnsi" w:hAnsiTheme="minorHAnsi" w:cstheme="minorHAnsi"/>
-          <w:szCs w:val="24"/>
-        </w:rPr>
-        <w:t>{“</w:t>
-      </w:r>
-      <w:proofErr w:type="spellStart"/>
-      <w:r>
-        <w:rPr>
-          <w:rFonts w:asciiTheme="minorHAnsi" w:hAnsiTheme="minorHAnsi" w:cstheme="minorHAnsi"/>
-          <w:szCs w:val="24"/>
-        </w:rPr>
-        <w:t>path</w:t>
-      </w:r>
-      <w:proofErr w:type="spellEnd"/>
-      <w:r>
-        <w:rPr>
-          <w:rFonts w:asciiTheme="minorHAnsi" w:hAnsiTheme="minorHAnsi" w:cstheme="minorHAnsi"/>
-          <w:szCs w:val="24"/>
-        </w:rPr>
-        <w:t>“:“</w:t>
-      </w:r>
-      <w:proofErr w:type="spellStart"/>
+        <w:t>[[%img</w:t>
+      </w:r>
+      <w:r>
+        <w:rPr>
+          <w:rFonts w:asciiTheme="minorHAnsi" w:hAnsiTheme="minorHAnsi" w:cstheme="minorHAnsi"/>
+          <w:szCs w:val="24"/>
+        </w:rPr>
+        <w:t>{“path“:“</w:t>
+      </w:r>
       <w:r>
         <w:rPr>
           <w:rFonts w:asciiTheme="minorHAnsi" w:hAnsiTheme="minorHAnsi" w:cstheme="minorHAnsi"/>
@@ -8545,7 +8001,6 @@
         </w:rPr>
         <w:t>entropizace</w:t>
       </w:r>
-      <w:proofErr w:type="spellEnd"/>
       <w:r>
         <w:rPr>
           <w:rFonts w:asciiTheme="minorHAnsi" w:hAnsiTheme="minorHAnsi" w:cstheme="minorHAnsi"/>
@@ -8594,23 +8049,7 @@
           <w:rFonts w:asciiTheme="minorHAnsi" w:hAnsiTheme="minorHAnsi" w:cstheme="minorHAnsi"/>
           <w:szCs w:val="24"/>
         </w:rPr>
-        <w:t xml:space="preserve">Úřadem zjištěná hodnota průměrné </w:t>
-      </w:r>
-      <w:proofErr w:type="spellStart"/>
-      <w:r>
-        <w:rPr>
-          <w:rFonts w:asciiTheme="minorHAnsi" w:hAnsiTheme="minorHAnsi" w:cstheme="minorHAnsi"/>
-          <w:szCs w:val="24"/>
-        </w:rPr>
-        <w:t>entropizace</w:t>
-      </w:r>
-      <w:proofErr w:type="spellEnd"/>
-      <w:r>
-        <w:rPr>
-          <w:rFonts w:asciiTheme="minorHAnsi" w:hAnsiTheme="minorHAnsi" w:cstheme="minorHAnsi"/>
-          <w:szCs w:val="24"/>
-        </w:rPr>
-        <w:t xml:space="preserve"> cen vybraného produktu byla ve vybraném období </w:t>
+        <w:t xml:space="preserve">Úřadem zjištěná hodnota průměrné entropizace cen vybraného produktu byla ve vybraném období </w:t>
       </w:r>
       <w:r>
         <w:rPr>
@@ -8627,31 +8066,8 @@
           <w:b/>
           <w:bCs/>
           <w:szCs w:val="24"/>
-          <w:lang w:val="en-US"/>
-        </w:rPr>
-        <w:t>[</w:t>
-      </w:r>
-      <w:proofErr w:type="spellStart"/>
-      <w:r>
-        <w:rPr>
-          <w:rFonts w:asciiTheme="minorHAnsi" w:hAnsiTheme="minorHAnsi" w:cstheme="minorHAnsi"/>
-          <w:b/>
-          <w:bCs/>
-          <w:szCs w:val="24"/>
-          <w:lang w:val="en-US"/>
-        </w:rPr>
-        <w:t>avg_diB</w:t>
-      </w:r>
-      <w:proofErr w:type="spellEnd"/>
-      <w:r>
-        <w:rPr>
-          <w:rFonts w:asciiTheme="minorHAnsi" w:hAnsiTheme="minorHAnsi" w:cstheme="minorHAnsi"/>
-          <w:b/>
-          <w:bCs/>
-          <w:szCs w:val="24"/>
-          <w:lang w:val="en-US"/>
-        </w:rPr>
-        <w:t>]</w:t>
+        </w:rPr>
+        <w:t>[avg_diB]</w:t>
       </w:r>
       <w:r>
         <w:rPr>
@@ -8833,12 +8249,6 @@
       <w:r>
         <w:t>,</w:t>
       </w:r>
-      <w:r>
-        <w:rPr>
-          <w:vertAlign w:val="superscript"/>
-        </w:rPr>
-        <w:footnoteReference w:id="4"/>
-      </w:r>
     </w:p>
     <w:p>
       <w:pPr>
@@ -8914,16 +8324,31 @@
         </m:r>
       </m:oMath>
       <w:r>
-        <w:t>. Čím blíže je hodnota determinace cen bližší jedné tím spíše lze zkoumaný systém označit za deterministický</w:t>
-      </w:r>
-      <w:r>
-        <w:rPr>
-          <w:vertAlign w:val="superscript"/>
-        </w:rPr>
-        <w:footnoteReference w:id="5"/>
-      </w:r>
-      <w:r>
-        <w:t xml:space="preserve"> a zároveň za systém s nízkou mírou entropie, tj. vysokou organizovaností. Ve zkoumaných podmínkách by hodnota 1 znamenala, že po celé sledované období směřovaly ceny k jejich dokonalé sladěnosti.</w:t>
+        <w:t xml:space="preserve">. Čím blíže je hodnota determinace cen bližší jedné tím spíše lze zkoumaný systém označit za deterministický </w:t>
+      </w:r>
+      <w:r>
+        <w:t>(p</w:t>
+      </w:r>
+      <w:r>
+        <w:t>ravděpodobnost znalosti budoucího stavu se blíží jedné</w:t>
+      </w:r>
+      <w:r>
+        <w:t xml:space="preserve">) </w:t>
+      </w:r>
+      <w:r>
+        <w:t>a</w:t>
+      </w:r>
+      <w:r>
+        <w:t> </w:t>
+      </w:r>
+      <w:r>
+        <w:t>zároveň za systém s nízkou mírou entropie, tj. vysokou organizovaností. Ve zkoumaných podmínkách by hodnota 1 znamenala, že po celé sledované období směřovaly ceny k jejich dokonalé sladěnosti.</w:t>
+      </w:r>
+      <w:r>
+        <w:t xml:space="preserve"> Úřad doplňuje, že ú</w:t>
+      </w:r>
+      <w:r>
+        <w:t>rovňová konstanta 1 je přidána pouze z důvodu snadné interpretovatelnosti a zachování principu interpretace hodnot blížících se k jedné, jinak by hraniční hodnotou byla 0.</w:t>
       </w:r>
     </w:p>
     <w:p>
@@ -8937,15 +8362,21 @@
     </w:p>
     <w:p>
       <w:pPr>
-        <w:numPr>
-          <w:ilvl w:val="0"/>
-          <w:numId w:val="23"/>
-        </w:numPr>
+        <w:tabs>
+          <w:tab w:val="left" w:pos="1276"/>
+        </w:tabs>
         <w:suppressAutoHyphens w:val="0"/>
         <w:spacing w:before="120" w:after="120"/>
-        <w:ind w:left="1276"/>
+        <w:ind w:left="1276" w:hanging="709"/>
         <w:contextualSpacing/>
       </w:pPr>
+      <w:r>
+        <w:lastRenderedPageBreak/>
+        <w:t>i)</w:t>
+      </w:r>
+      <w:r>
+        <w:tab/>
+      </w:r>
       <m:oMath>
         <m:sSup>
           <m:sSupPr>
@@ -9004,15 +8435,20 @@
     </w:p>
     <w:p>
       <w:pPr>
-        <w:numPr>
-          <w:ilvl w:val="0"/>
-          <w:numId w:val="23"/>
-        </w:numPr>
+        <w:tabs>
+          <w:tab w:val="left" w:pos="1276"/>
+        </w:tabs>
         <w:suppressAutoHyphens w:val="0"/>
         <w:spacing w:before="120" w:after="120"/>
-        <w:ind w:left="1276"/>
+        <w:ind w:left="1276" w:hanging="709"/>
         <w:contextualSpacing/>
       </w:pPr>
+      <w:r>
+        <w:t>ii)</w:t>
+      </w:r>
+      <w:r>
+        <w:tab/>
+      </w:r>
       <m:oMath>
         <m:sSup>
           <m:sSupPr>
@@ -9086,14 +8522,19 @@
     </w:p>
     <w:p>
       <w:pPr>
-        <w:numPr>
-          <w:ilvl w:val="0"/>
-          <w:numId w:val="23"/>
-        </w:numPr>
+        <w:tabs>
+          <w:tab w:val="left" w:pos="1276"/>
+        </w:tabs>
         <w:suppressAutoHyphens w:val="0"/>
         <w:spacing w:after="120"/>
-        <w:ind w:left="1276"/>
-      </w:pPr>
+        <w:ind w:left="1276" w:hanging="709"/>
+      </w:pPr>
+      <w:r>
+        <w:t>iii)</w:t>
+      </w:r>
+      <w:r>
+        <w:tab/>
+      </w:r>
       <m:oMath>
         <m:sSup>
           <m:sSupPr>
@@ -9189,6 +8630,40 @@
         </w:rPr>
         <w:t xml:space="preserve">Úřadem zjištěná hodnota míry determinace cen vybraného produktu byla ve zvoleném období </w:t>
       </w:r>
+      <m:oMath>
+        <m:sSup>
+          <m:sSupPr>
+            <m:ctrlPr>
+              <w:rPr>
+                <w:rFonts w:ascii="Cambria Math" w:hAnsi="Cambria Math"/>
+                <w:i/>
+              </w:rPr>
+            </m:ctrlPr>
+          </m:sSupPr>
+          <m:e>
+            <m:r>
+              <w:rPr>
+                <w:rFonts w:ascii="Cambria Math" w:hAnsi="Cambria Math"/>
+              </w:rPr>
+              <m:t>D</m:t>
+            </m:r>
+          </m:e>
+          <m:sup>
+            <m:r>
+              <w:rPr>
+                <w:rFonts w:ascii="Cambria Math" w:hAnsi="Cambria Math"/>
+              </w:rPr>
+              <m:t>X</m:t>
+            </m:r>
+          </m:sup>
+        </m:sSup>
+        <m:r>
+          <w:rPr>
+            <w:rFonts w:ascii="Cambria Math" w:hAnsi="Cambria Math"/>
+          </w:rPr>
+          <m:t>=</m:t>
+        </m:r>
+      </m:oMath>
       <w:r>
         <w:rPr>
           <w:rFonts w:asciiTheme="minorHAnsi" w:hAnsiTheme="minorHAnsi" w:cstheme="minorHAnsi"/>
@@ -9196,9 +8671,8 @@
           <w:bCs/>
           <w:szCs w:val="24"/>
         </w:rPr>
-        <w:t>[[</w:t>
-      </w:r>
-      <w:proofErr w:type="spellStart"/>
+        <w:t xml:space="preserve"> </w:t>
+      </w:r>
       <w:r>
         <w:rPr>
           <w:rFonts w:asciiTheme="minorHAnsi" w:hAnsiTheme="minorHAnsi" w:cstheme="minorHAnsi"/>
@@ -9206,9 +8680,8 @@
           <w:bCs/>
           <w:szCs w:val="24"/>
         </w:rPr>
-        <w:t>determ</w:t>
-      </w:r>
-      <w:proofErr w:type="spellEnd"/>
+        <w:t>[[</w:t>
+      </w:r>
       <w:r>
         <w:rPr>
           <w:rFonts w:asciiTheme="minorHAnsi" w:hAnsiTheme="minorHAnsi" w:cstheme="minorHAnsi"/>
@@ -9216,62 +8689,23 @@
           <w:bCs/>
           <w:szCs w:val="24"/>
         </w:rPr>
-        <w:t>]]</w:t>
-      </w:r>
-      <w:r>
-        <w:rPr>
-          <w:rFonts w:asciiTheme="minorHAnsi" w:hAnsiTheme="minorHAnsi" w:cstheme="minorHAnsi"/>
-          <w:szCs w:val="24"/>
-        </w:rPr>
-        <w:t>.</w:t>
-      </w:r>
-    </w:p>
-    <w:p>
-      <w:pPr>
-        <w:spacing w:before="120" w:after="120"/>
-        <w:rPr>
-          <w:rFonts w:asciiTheme="minorHAnsi" w:hAnsiTheme="minorHAnsi" w:cstheme="minorHAnsi"/>
-          <w:szCs w:val="24"/>
-        </w:rPr>
-      </w:pPr>
-    </w:p>
-    <w:p>
-      <w:pPr>
-        <w:spacing w:before="120" w:after="120"/>
-        <w:rPr>
-          <w:rFonts w:asciiTheme="minorHAnsi" w:hAnsiTheme="minorHAnsi" w:cstheme="minorHAnsi"/>
-          <w:szCs w:val="24"/>
-        </w:rPr>
-      </w:pPr>
-    </w:p>
-    <w:p>
-      <w:pPr>
-        <w:spacing w:before="120" w:after="120"/>
-        <w:rPr>
-          <w:rFonts w:asciiTheme="minorHAnsi" w:hAnsiTheme="minorHAnsi" w:cstheme="minorHAnsi"/>
-          <w:szCs w:val="24"/>
-        </w:rPr>
-      </w:pPr>
-    </w:p>
-    <w:p>
-      <w:pPr>
-        <w:spacing w:before="120" w:after="120"/>
-        <w:rPr>
-          <w:rFonts w:asciiTheme="minorHAnsi" w:hAnsiTheme="minorHAnsi" w:cstheme="minorHAnsi"/>
-          <w:szCs w:val="24"/>
-        </w:rPr>
-      </w:pPr>
-    </w:p>
-    <w:p>
-      <w:pPr>
-        <w:jc w:val="left"/>
-        <w:rPr>
+        <w:t>determ</w:t>
+      </w:r>
+      <w:r>
+        <w:rPr>
+          <w:rFonts w:asciiTheme="minorHAnsi" w:hAnsiTheme="minorHAnsi" w:cstheme="minorHAnsi"/>
           <w:b/>
           <w:bCs/>
-        </w:rPr>
-      </w:pPr>
-      <w:r>
-        <w:br w:type="page"/>
+          <w:szCs w:val="24"/>
+        </w:rPr>
+        <w:t>]]</w:t>
+      </w:r>
+      <w:r>
+        <w:rPr>
+          <w:rFonts w:asciiTheme="minorHAnsi" w:hAnsiTheme="minorHAnsi" w:cstheme="minorHAnsi"/>
+          <w:szCs w:val="24"/>
+        </w:rPr>
+        <w:t>.</w:t>
       </w:r>
     </w:p>
     <w:p>
@@ -9282,6 +8716,9 @@
           <w:bCs/>
         </w:rPr>
       </w:pPr>
+      <w:r>
+        <w:br w:type="page"/>
+      </w:r>
     </w:p>
     <w:p>
       <w:pPr>
@@ -9294,46 +8731,9 @@
         <w:rPr>
           <w:rFonts w:ascii="Liberation Sans" w:hAnsi="Liberation Sans"/>
         </w:rPr>
-        <w:t>[[/</w:t>
-      </w:r>
-      <w:proofErr w:type="spellStart"/>
-      <w:r>
-        <w:rPr>
-          <w:rFonts w:ascii="Liberation Sans" w:hAnsi="Liberation Sans"/>
-        </w:rPr>
-        <w:t>products</w:t>
-      </w:r>
-      <w:proofErr w:type="spellEnd"/>
-      <w:r>
-        <w:rPr>
-          <w:rFonts w:ascii="Liberation Sans" w:hAnsi="Liberation Sans"/>
-        </w:rPr>
-        <w:t>]]</w:t>
-      </w:r>
-    </w:p>
-    <w:p>
-      <w:pPr>
-        <w:jc w:val="left"/>
-        <w:rPr>
-          <w:rFonts w:ascii="Liberation Sans" w:hAnsi="Liberation Sans"/>
-        </w:rPr>
-      </w:pPr>
-    </w:p>
-    <w:p>
-      <w:pPr>
-        <w:jc w:val="left"/>
-        <w:rPr>
-          <w:rFonts w:ascii="Liberation Sans" w:hAnsi="Liberation Sans"/>
-        </w:rPr>
-      </w:pPr>
-    </w:p>
-    <w:p>
-      <w:pPr>
-        <w:jc w:val="left"/>
-        <w:rPr>
-          <w:rFonts w:ascii="Liberation Sans" w:hAnsi="Liberation Sans"/>
-        </w:rPr>
-      </w:pPr>
+        <w:lastRenderedPageBreak/>
+        <w:t>[[/products]]</w:t>
+      </w:r>
     </w:p>
     <w:sectPr>
       <w:headerReference w:type="default" r:id="rId14"/>
@@ -9531,137 +8931,6 @@
     <w:p>
       <w:r>
         <w:continuationSeparator/>
-      </w:r>
-    </w:p>
-  </w:footnote>
-  <w:footnote w:id="1">
-    <w:p>
-      <w:pPr>
-        <w:pStyle w:val="Textpoznpodarou"/>
-      </w:pPr>
-      <w:r>
-        <w:rPr>
-          <w:rStyle w:val="Znakapoznpodarou"/>
-        </w:rPr>
-        <w:footnoteRef/>
-      </w:r>
-      <w:r>
-        <w:t xml:space="preserve"> Např. byly-li by pozorovány pouze dvě různé ceny, tak by hodnota sladěnosti cen byla </w:t>
-      </w:r>
-      <m:oMath>
-        <m:sSubSup>
-          <m:sSubSupPr>
-            <m:ctrlPr>
-              <w:rPr>
-                <w:rFonts w:ascii="Cambria Math" w:hAnsi="Cambria Math"/>
-                <w:i/>
-              </w:rPr>
-            </m:ctrlPr>
-          </m:sSubSupPr>
-          <m:e>
-            <m:r>
-              <w:rPr>
-                <w:rFonts w:ascii="Cambria Math" w:hAnsi="Cambria Math"/>
-              </w:rPr>
-              <m:t>s</m:t>
-            </m:r>
-          </m:e>
-          <m:sub>
-            <m:r>
-              <w:rPr>
-                <w:rFonts w:ascii="Cambria Math" w:hAnsi="Cambria Math"/>
-              </w:rPr>
-              <m:t>t</m:t>
-            </m:r>
-          </m:sub>
-          <m:sup>
-            <m:r>
-              <w:rPr>
-                <w:rFonts w:ascii="Cambria Math" w:hAnsi="Cambria Math"/>
-              </w:rPr>
-              <m:t>X</m:t>
-            </m:r>
-          </m:sup>
-        </m:sSubSup>
-        <m:r>
-          <w:rPr>
-            <w:rFonts w:ascii="Cambria Math" w:hAnsi="Cambria Math"/>
-          </w:rPr>
-          <m:t>=0,5</m:t>
-        </m:r>
-      </m:oMath>
-      <w:r>
-        <w:t>, což by chybně mohlo vést k závěru o relativní sladěnosti na trhu pozorovaných cen.</w:t>
-      </w:r>
-    </w:p>
-  </w:footnote>
-  <w:footnote w:id="2">
-    <w:p>
-      <w:pPr>
-        <w:pStyle w:val="Textpoznpodarou"/>
-      </w:pPr>
-      <w:r>
-        <w:rPr>
-          <w:rStyle w:val="Znakapoznpodarou"/>
-        </w:rPr>
-        <w:footnoteRef/>
-      </w:r>
-      <w:r>
-        <w:t xml:space="preserve"> Pozn.: omikron.</w:t>
-      </w:r>
-    </w:p>
-  </w:footnote>
-  <w:footnote w:id="3">
-    <w:p>
-      <w:pPr>
-        <w:pStyle w:val="Textpoznpodarou"/>
-      </w:pPr>
-      <w:r>
-        <w:rPr>
-          <w:rStyle w:val="Znakapoznpodarou"/>
-        </w:rPr>
-        <w:footnoteRef/>
-      </w:r>
-      <w:r>
-        <w:t xml:space="preserve"> Entropie vyjadřuje míru neuspořádanosti zkoumaného systému. V analyzovaných podmínkách platí, že tržní situace vzniklá z nezávislého jednání tržních subjektů bude vykazovat relativně vyšší entropii, tj. neuspořádanost. Na druhou stranu se zásah „zvenčí“ projeví rostoucí mírou uspořádání (sladěním cen), a tedy nižší entropií. </w:t>
-      </w:r>
-    </w:p>
-  </w:footnote>
-  <w:footnote w:id="4">
-    <w:p>
-      <w:pPr>
-        <w:pStyle w:val="Textpoznpodarou"/>
-      </w:pPr>
-      <w:r>
-        <w:rPr>
-          <w:rStyle w:val="Znakapoznpodarou"/>
-        </w:rPr>
-        <w:footnoteRef/>
-      </w:r>
-      <w:r>
-        <w:t xml:space="preserve"> Úrovňová konstanta 1 je přidána pouze z důvodu snadné interpretovatelnosti a zachování principu interpretace hodnot </w:t>
-      </w:r>
-      <w:r>
-        <w:t>b</w:t>
-      </w:r>
-      <w:r>
-        <w:t>lížících se k jedné, jinak by hraniční hodnotou byla 0.</w:t>
-      </w:r>
-    </w:p>
-  </w:footnote>
-  <w:footnote w:id="5">
-    <w:p>
-      <w:pPr>
-        <w:pStyle w:val="Textpoznpodarou"/>
-      </w:pPr>
-      <w:r>
-        <w:rPr>
-          <w:rStyle w:val="Znakapoznpodarou"/>
-        </w:rPr>
-        <w:footnoteRef/>
-      </w:r>
-      <w:r>
-        <w:t xml:space="preserve"> Pravděpodobnost znalosti budoucího stavu se blíží jedné.</w:t>
       </w:r>
     </w:p>
   </w:footnote>

</xml_diff>